<commit_message>
Piano della settimana: weekend, due invii a RetailTune, alternativa alla call KOS, testi KOS 21-23 con le categorie
Co-Authored-By: Claude Opus 5.5 <noreply@anthropic.com>
Claude-Session: https://claude.ai/code/session_01Rr1X44gsg7BUwMzrRvYrc2
</commit_message>
<xml_diff>
--- a/docs/docx/piano-settimana-2-6-novembre.docx
+++ b/docs/docx/piano-settimana-2-6-novembre.docx
@@ -2,7 +2,7 @@
 <file path=word/document.xml><?xml version="1.0" encoding="utf-8"?>
 <w:document xmlns:w="http://schemas.openxmlformats.org/wordprocessingml/2006/main" xmlns:m="http://schemas.openxmlformats.org/officeDocument/2006/math" xmlns:r="http://schemas.openxmlformats.org/officeDocument/2006/relationships" xmlns:o="urn:schemas-microsoft-com:office:office" xmlns:v="urn:schemas-microsoft-com:vml" xmlns:w10="urn:schemas-microsoft-com:office:word" xmlns:a="http://schemas.openxmlformats.org/drawingml/2006/main" xmlns:pic="http://schemas.openxmlformats.org/drawingml/2006/picture" xmlns:wp="http://schemas.openxmlformats.org/drawingml/2006/wordprocessingDrawing">
   <w:body>
-    <w:bookmarkStart w:id="32" w:name="X4d9970faf1cc5a08ce749cd59924c4c819b2c33"/>
+    <w:bookmarkStart w:id="33" w:name="X4d9970faf1cc5a08ce749cd59924c4c819b2c33"/>
     <w:p>
       <w:pPr>
         <w:pStyle w:val="Heading1"/>
@@ -16,7 +16,7 @@
         <w:pStyle w:val="FirstParagraph"/>
       </w:pPr>
       <w:r>
-        <w:t xml:space="preserve">Documento interno (Danilo e Claude), 30 ottobre 2026. Non va condiviso con KOS né con l'agenzia.</w:t>
+        <w:t xml:space="preserve">Documento interno (Danilo e Claude), 30 ottobre 2026, aggiornato la sera stessa (weekend, invii anticipati a RetailTune). Non va condiviso con KOS né con l'agenzia.</w:t>
       </w:r>
     </w:p>
     <w:bookmarkStart w:id="20" w:name="obiettivo"/>
@@ -96,7 +96,13 @@
         <w:t xml:space="preserve">RetailTune</w:t>
       </w:r>
       <w:r>
-        <w:t xml:space="preserve">: pacchetto consegnato prima del kickoff del 5/11 e import dei dati anagrafici fatto.</w:t>
+        <w:t xml:space="preserve">: il 5/11 è una data di partenza concordata tra KOS e RetailTune, senza orario. Tutto ciò che si può mandare prima</w:t>
+      </w:r>
+      <w:r>
+        <w:t xml:space="preserve"> </w:t>
+      </w:r>
+      <w:r>
+        <w:t xml:space="preserve">va mandato prima: prima parte lunedì 2/11, seconda parte (sedi) appena c'è l'export Yext corretto.</w:t>
       </w:r>
     </w:p>
     <w:p>
@@ -271,7 +277,7 @@
               <w:jc w:val="left"/>
             </w:pPr>
             <w:r>
-              <w:t xml:space="preserve">Kickoff ufficiale RetailTune</w:t>
+              <w:t xml:space="preserve">Partenza ufficiale RetailTune (data, nessun orario)</w:t>
             </w:r>
           </w:p>
         </w:tc>
@@ -1069,13 +1075,56 @@
       </w:tr>
     </w:tbl>
     <w:bookmarkEnd w:id="22"/>
-    <w:bookmarkStart w:id="23" w:name="X38e917306fe5a6e847b8cca1cd54e9de8f9c474"/>
+    <w:bookmarkStart w:id="23" w:name="il-pacchetto-per-retailtune-in-due-invii"/>
     <w:p>
       <w:pPr>
         <w:pStyle w:val="Heading2"/>
       </w:pPr>
       <w:r>
-        <w:t xml:space="preserve">Il pacchetto per RetailTune (consegna mercoledì 4/11 sera)</w:t>
+        <w:t xml:space="preserve">Il pacchetto per RetailTune, in due invii</w:t>
+      </w:r>
+    </w:p>
+    <w:p>
+      <w:pPr>
+        <w:pStyle w:val="FirstParagraph"/>
+      </w:pPr>
+      <w:r>
+        <w:rPr>
+          <w:bCs/>
+          <w:b/>
+        </w:rPr>
+        <w:t xml:space="preserve">Primo invio, lunedì 2/11</w:t>
+      </w:r>
+      <w:r>
+        <w:t xml:space="preserve"> </w:t>
+      </w:r>
+      <w:r>
+        <w:t xml:space="preserve">(non dipende dall'export Yext): punti 2, 4, 5, 6, 7 e la proposta del punto 3, segnalata come</w:t>
+      </w:r>
+      <w:r>
+        <w:t xml:space="preserve"> </w:t>
+      </w:r>
+      <w:r>
+        <w:t xml:space="preserve">in attesa del riscontro dell'agenzia.</w:t>
+      </w:r>
+      <w:r>
+        <w:t xml:space="preserve"> </w:t>
+      </w:r>
+      <w:r>
+        <w:rPr>
+          <w:bCs/>
+          <w:b/>
+        </w:rPr>
+        <w:t xml:space="preserve">Secondo invio, mercoledì 4/11 o giovedì 5/11</w:t>
+      </w:r>
+      <w:r>
+        <w:t xml:space="preserve">: il punto 1 dall'export corretto e il</w:t>
+      </w:r>
+      <w:r>
+        <w:t xml:space="preserve"> </w:t>
+      </w:r>
+      <w:r>
+        <w:t xml:space="preserve">punto 3 definitivo.</w:t>
       </w:r>
     </w:p>
     <w:p>
@@ -1332,7 +1381,7 @@
       </w:r>
     </w:p>
     <w:bookmarkEnd w:id="23"/>
-    <w:bookmarkStart w:id="29" w:name="programma"/>
+    <w:bookmarkStart w:id="30" w:name="programma"/>
     <w:p>
       <w:pPr>
         <w:pStyle w:val="Heading2"/>
@@ -1381,13 +1430,21 @@
         <w:t xml:space="preserve">= Claude. Le stime di Danilo sono in ore effettive.</w:t>
       </w:r>
     </w:p>
-    <w:bookmarkStart w:id="24" w:name="lunedì-211--preparazione"/>
+    <w:bookmarkStart w:id="24" w:name="X6c88cb8ab8bb842e40fe2ba9c248a69273f69d8"/>
     <w:p>
       <w:pPr>
         <w:pStyle w:val="Heading3"/>
       </w:pPr>
       <w:r>
-        <w:t xml:space="preserve">Lunedì 2/11 — preparazione</w:t>
+        <w:t xml:space="preserve">Sabato 31/10 e domenica 1/11 — qualche ora per partire prima</w:t>
+      </w:r>
+    </w:p>
+    <w:p>
+      <w:pPr>
+        <w:pStyle w:val="FirstParagraph"/>
+      </w:pPr>
+      <w:r>
+        <w:t xml:space="preserve">Nessun rilascio in produzione nel weekend: solo preparazione e, se serve, stage.</w:t>
       </w:r>
     </w:p>
     <w:tbl>
@@ -1452,7 +1509,7 @@
               <w:jc w:val="left"/>
             </w:pPr>
             <w:r>
-              <w:t xml:space="preserve">8:30-9:30</w:t>
+              <w:t xml:space="preserve">Sabato, 3-4 ore</w:t>
             </w:r>
           </w:p>
         </w:tc>
@@ -1476,33 +1533,21 @@
               <w:jc w:val="left"/>
             </w:pPr>
             <w:r>
-              <w:t xml:space="preserve">Stato di partenza in produzione: PDF KOS 8 e AA 3 (classificazione,</w:t>
-            </w:r>
-            <w:r>
-              <w:t xml:space="preserve"> </w:t>
-            </w:r>
-            <w:r>
-              <w:rPr>
-                <w:rStyle w:val="VerbatimChar"/>
-              </w:rPr>
-              <w:t xml:space="preserve">X-Robots-Tag</w:t>
-            </w:r>
-            <w:r>
-              <w:t xml:space="preserve">, titoli), alt mancanti, misura del tempo di risposta. Elenco aggiornato delle cose da fare</w:t>
-            </w:r>
-          </w:p>
-        </w:tc>
-      </w:tr>
-      <w:tr>
-        <w:tc>
-          <w:tcPr/>
-          <w:p>
-            <w:pPr>
-              <w:pStyle w:val="Compact"/>
-              <w:jc w:val="left"/>
-            </w:pPr>
-            <w:r>
-              <w:t xml:space="preserve">8:30-9:00</w:t>
+              <w:t xml:space="preserve">Stato di partenza in produzione (PDF KOS 8 e AA 3, alt mancanti, tempo di risposta); bozza del primo invio a RetailTune (tipologie, attributi, specifiche dei widget, corrispondenza dei campi, domande aperte); bozza delle categorie GBP</w:t>
+            </w:r>
+          </w:p>
+        </w:tc>
+      </w:tr>
+      <w:tr>
+        <w:tc>
+          <w:tcPr/>
+          <w:p>
+            <w:pPr>
+              <w:pStyle w:val="Compact"/>
+              <w:jc w:val="left"/>
+            </w:pPr>
+            <w:r>
+              <w:t xml:space="preserve">Sabato</w:t>
             </w:r>
           </w:p>
         </w:tc>
@@ -1526,21 +1571,59 @@
               <w:jc w:val="left"/>
             </w:pPr>
             <w:r>
-              <w:t xml:space="preserve">Invito a KOS per la call sulle correzioni Yext (martedì mattina, 1 ora); account Meilisearch e progetto Google Cloud per la prova della ricerca (15 minuti)</w:t>
-            </w:r>
-          </w:p>
-        </w:tc>
-      </w:tr>
-      <w:tr>
-        <w:tc>
-          <w:tcPr/>
-          <w:p>
-            <w:pPr>
-              <w:pStyle w:val="Compact"/>
-              <w:jc w:val="left"/>
-            </w:pPr>
-            <w:r>
-              <w:t xml:space="preserve">9:00-10:00</w:t>
+              <w:t xml:space="preserve">Revisione delle bozze RetailTune e categorie, a blocchi man mano che sono pronte</w:t>
+            </w:r>
+          </w:p>
+        </w:tc>
+      </w:tr>
+      <w:tr>
+        <w:tc>
+          <w:tcPr/>
+          <w:p>
+            <w:pPr>
+              <w:pStyle w:val="Compact"/>
+              <w:jc w:val="left"/>
+            </w:pPr>
+            <w:r>
+              <w:t xml:space="preserve">Domenica, 3-4 ore</w:t>
+            </w:r>
+          </w:p>
+        </w:tc>
+        <w:tc>
+          <w:tcPr/>
+          <w:p>
+            <w:pPr>
+              <w:pStyle w:val="Compact"/>
+              <w:jc w:val="left"/>
+            </w:pPr>
+            <w:r>
+              <w:t xml:space="preserve">C</w:t>
+            </w:r>
+          </w:p>
+        </w:tc>
+        <w:tc>
+          <w:tcPr/>
+          <w:p>
+            <w:pPr>
+              <w:pStyle w:val="Compact"/>
+              <w:jc w:val="left"/>
+            </w:pPr>
+            <w:r>
+              <w:t xml:space="preserve">Elenco delle domande per la call KOS (foglio dei punti aperti + errori attivi delle schede); proposta dei testi KOS 21-23; proposta AA 20 fuori audit</w:t>
+            </w:r>
+          </w:p>
+        </w:tc>
+      </w:tr>
+      <w:tr>
+        <w:tc>
+          <w:tcPr/>
+          <w:p>
+            <w:pPr>
+              <w:pStyle w:val="Compact"/>
+              <w:jc w:val="left"/>
+            </w:pPr>
+            <w:r>
+              <w:t xml:space="preserve">Domenica</w:t>
             </w:r>
           </w:p>
         </w:tc>
@@ -1564,328 +1647,20 @@
               <w:jc w:val="left"/>
             </w:pPr>
             <w:r>
-              <w:t xml:space="preserve">Stage su</w:t>
-            </w:r>
-            <w:r>
-              <w:t xml:space="preserve"> </w:t>
-            </w:r>
-            <w:r>
-              <w:rPr>
-                <w:rStyle w:val="VerbatimChar"/>
-              </w:rPr>
-              <w:t xml:space="preserve">stage.anniazzurri.it</w:t>
-            </w:r>
-            <w:r>
-              <w:t xml:space="preserve"> </w:t>
-            </w:r>
-            <w:r>
-              <w:t xml:space="preserve">e</w:t>
-            </w:r>
-            <w:r>
-              <w:t xml:space="preserve"> </w:t>
-            </w:r>
-            <w:r>
-              <w:rPr>
-                <w:rStyle w:val="VerbatimChar"/>
-              </w:rPr>
-              <w:t xml:space="preserve">stage.kosgroup.com</w:t>
-            </w:r>
-            <w:r>
-              <w:t xml:space="preserve">; filtri GTM per hostname</w:t>
-            </w:r>
-          </w:p>
-        </w:tc>
-      </w:tr>
-      <w:tr>
-        <w:tc>
-          <w:tcPr/>
-          <w:p>
-            <w:pPr>
-              <w:pStyle w:val="Compact"/>
-              <w:jc w:val="left"/>
-            </w:pPr>
-            <w:r>
-              <w:t xml:space="preserve">9:30-12:30</w:t>
-            </w:r>
-          </w:p>
-        </w:tc>
-        <w:tc>
-          <w:tcPr/>
-          <w:p>
-            <w:pPr>
-              <w:pStyle w:val="Compact"/>
-              <w:jc w:val="left"/>
-            </w:pPr>
-            <w:r>
-              <w:t xml:space="preserve">C</w:t>
-            </w:r>
-          </w:p>
-        </w:tc>
-        <w:tc>
-          <w:tcPr/>
-          <w:p>
-            <w:pPr>
-              <w:pStyle w:val="Compact"/>
-              <w:jc w:val="left"/>
-            </w:pPr>
-            <w:r>
-              <w:t xml:space="preserve">Domande per la call KOS: foglio</w:t>
-            </w:r>
-            <w:r>
-              <w:t xml:space="preserve"> </w:t>
-            </w:r>
-            <w:r>
-              <w:rPr>
-                <w:rStyle w:val="VerbatimChar"/>
-              </w:rPr>
-              <w:t xml:space="preserve">punti-aperti-kos-yext-2026-10-29.xlsx</w:t>
-            </w:r>
-            <w:r>
-              <w:t xml:space="preserve"> </w:t>
-            </w:r>
-            <w:r>
-              <w:t xml:space="preserve">+ errori attivi delle schede (specifica, sezione 5) in un solo elenco, ordinato per impatto, con la risposta predefinita</w:t>
-            </w:r>
-          </w:p>
-        </w:tc>
-      </w:tr>
-      <w:tr>
-        <w:tc>
-          <w:tcPr/>
-          <w:p>
-            <w:pPr>
-              <w:pStyle w:val="Compact"/>
-              <w:jc w:val="left"/>
-            </w:pPr>
-            <w:r>
-              <w:t xml:space="preserve">10:00-11:00</w:t>
-            </w:r>
-          </w:p>
-        </w:tc>
-        <w:tc>
-          <w:tcPr/>
-          <w:p>
-            <w:pPr>
-              <w:pStyle w:val="Compact"/>
-              <w:jc w:val="left"/>
-            </w:pPr>
-            <w:r>
-              <w:t xml:space="preserve">D</w:t>
-            </w:r>
-          </w:p>
-        </w:tc>
-        <w:tc>
-          <w:tcPr/>
-          <w:p>
-            <w:pPr>
-              <w:pStyle w:val="Compact"/>
-              <w:jc w:val="left"/>
-            </w:pPr>
-            <w:r>
-              <w:t xml:space="preserve">Verifiche sugli errori attivi delle schede (punto 4 rimasto dal 30/10), così vanno nella call</w:t>
-            </w:r>
-          </w:p>
-        </w:tc>
-      </w:tr>
-      <w:tr>
-        <w:tc>
-          <w:tcPr/>
-          <w:p>
-            <w:pPr>
-              <w:pStyle w:val="Compact"/>
-              <w:jc w:val="left"/>
-            </w:pPr>
-            <w:r>
-              <w:t xml:space="preserve">9:30-13:00</w:t>
-            </w:r>
-          </w:p>
-        </w:tc>
-        <w:tc>
-          <w:tcPr/>
-          <w:p>
-            <w:pPr>
-              <w:pStyle w:val="Compact"/>
-              <w:jc w:val="left"/>
-            </w:pPr>
-            <w:r>
-              <w:t xml:space="preserve">C</w:t>
-            </w:r>
-          </w:p>
-        </w:tc>
-        <w:tc>
-          <w:tcPr/>
-          <w:p>
-            <w:pPr>
-              <w:pStyle w:val="Compact"/>
-              <w:jc w:val="left"/>
-            </w:pPr>
-            <w:r>
-              <w:t xml:space="preserve">Proposta delle categorie GBP per l'agenzia (residenze, poi gruppi KOS), per codice, con la motivazione e i concorrenti</w:t>
-            </w:r>
-          </w:p>
-        </w:tc>
-      </w:tr>
-      <w:tr>
-        <w:tc>
-          <w:tcPr/>
-          <w:p>
-            <w:pPr>
-              <w:pStyle w:val="Compact"/>
-              <w:jc w:val="left"/>
-            </w:pPr>
-            <w:r>
-              <w:t xml:space="preserve">14:00-17:00</w:t>
-            </w:r>
-          </w:p>
-        </w:tc>
-        <w:tc>
-          <w:tcPr/>
-          <w:p>
-            <w:pPr>
-              <w:pStyle w:val="Compact"/>
-              <w:jc w:val="left"/>
-            </w:pPr>
-            <w:r>
-              <w:t xml:space="preserve">C</w:t>
-            </w:r>
-          </w:p>
-        </w:tc>
-        <w:tc>
-          <w:tcPr/>
-          <w:p>
-            <w:pPr>
-              <w:pStyle w:val="Compact"/>
-              <w:jc w:val="left"/>
-            </w:pPr>
-            <w:r>
-              <w:t xml:space="preserve">KOS 21-23: proposta dei testi (title, description, H1) con le regole del piano; AA 20: proposta per le circa 90 pagine fuori audit</w:t>
-            </w:r>
-          </w:p>
-        </w:tc>
-      </w:tr>
-      <w:tr>
-        <w:tc>
-          <w:tcPr/>
-          <w:p>
-            <w:pPr>
-              <w:pStyle w:val="Compact"/>
-              <w:jc w:val="left"/>
-            </w:pPr>
-            <w:r>
-              <w:t xml:space="preserve">14:00-15:30</w:t>
-            </w:r>
-          </w:p>
-        </w:tc>
-        <w:tc>
-          <w:tcPr/>
-          <w:p>
-            <w:pPr>
-              <w:pStyle w:val="Compact"/>
-              <w:jc w:val="left"/>
-            </w:pPr>
-            <w:r>
-              <w:t xml:space="preserve">D</w:t>
-            </w:r>
-          </w:p>
-        </w:tc>
-        <w:tc>
-          <w:tcPr/>
-          <w:p>
-            <w:pPr>
-              <w:pStyle w:val="Compact"/>
-              <w:jc w:val="left"/>
-            </w:pPr>
-            <w:r>
-              <w:t xml:space="preserve">Revisione della proposta delle categorie</w:t>
-            </w:r>
-          </w:p>
-        </w:tc>
-      </w:tr>
-      <w:tr>
-        <w:tc>
-          <w:tcPr/>
-          <w:p>
-            <w:pPr>
-              <w:pStyle w:val="Compact"/>
-              <w:jc w:val="left"/>
-            </w:pPr>
-            <w:r>
-              <w:t xml:space="preserve">15:30-17:30</w:t>
-            </w:r>
-          </w:p>
-        </w:tc>
-        <w:tc>
-          <w:tcPr/>
-          <w:p>
-            <w:pPr>
-              <w:pStyle w:val="Compact"/>
-              <w:jc w:val="left"/>
-            </w:pPr>
-            <w:r>
-              <w:t xml:space="preserve">D</w:t>
-            </w:r>
-          </w:p>
-        </w:tc>
-        <w:tc>
-          <w:tcPr/>
-          <w:p>
-            <w:pPr>
-              <w:pStyle w:val="Compact"/>
-              <w:jc w:val="left"/>
-            </w:pPr>
-            <w:r>
-              <w:t xml:space="preserve">Validazione AA 20 fuori audit (con C, a blocchi)</w:t>
-            </w:r>
-          </w:p>
-        </w:tc>
-      </w:tr>
-      <w:tr>
-        <w:tc>
-          <w:tcPr/>
-          <w:p>
-            <w:pPr>
-              <w:pStyle w:val="Compact"/>
-              <w:jc w:val="left"/>
-            </w:pPr>
-            <w:r>
-              <w:t xml:space="preserve">17:00-18:30</w:t>
-            </w:r>
-          </w:p>
-        </w:tc>
-        <w:tc>
-          <w:tcPr/>
-          <w:p>
-            <w:pPr>
-              <w:pStyle w:val="Compact"/>
-              <w:jc w:val="left"/>
-            </w:pPr>
-            <w:r>
-              <w:t xml:space="preserve">C</w:t>
-            </w:r>
-          </w:p>
-        </w:tc>
-        <w:tc>
-          <w:tcPr/>
-          <w:p>
-            <w:pPr>
-              <w:pStyle w:val="Compact"/>
-              <w:jc w:val="left"/>
-            </w:pPr>
-            <w:r>
-              <w:t xml:space="preserve">Estensione dello script di verifica alle voci dello sprint 2 e 3 (PDF, title, Article, alt)</w:t>
+              <w:t xml:space="preserve">Verifiche sugli errori attivi delle schede (punto 4 rimasto dal 30/10); validazione AA 20 fuori audit con C</w:t>
             </w:r>
           </w:p>
         </w:tc>
       </w:tr>
     </w:tbl>
     <w:bookmarkEnd w:id="24"/>
-    <w:bookmarkStart w:id="25" w:name="X9d43cb72c2e96ffb48230fb7c4c5cea6730e92c"/>
+    <w:bookmarkStart w:id="25" w:name="X24f00ea4a91daa355d7933937e8c7ffd1eeb76f"/>
     <w:p>
       <w:pPr>
         <w:pStyle w:val="Heading3"/>
       </w:pPr>
       <w:r>
-        <w:t xml:space="preserve">Martedì 3/11 — call KOS, invio all'agenzia, primi rilasci</w:t>
+        <w:t xml:space="preserve">Lunedì 2/11 — inviti, primo invio a RetailTune, primi pacchetti</w:t>
       </w:r>
     </w:p>
     <w:tbl>
@@ -1950,6 +1725,44 @@
               <w:jc w:val="left"/>
             </w:pPr>
             <w:r>
+              <w:t xml:space="preserve">8:30-9:00</w:t>
+            </w:r>
+          </w:p>
+        </w:tc>
+        <w:tc>
+          <w:tcPr/>
+          <w:p>
+            <w:pPr>
+              <w:pStyle w:val="Compact"/>
+              <w:jc w:val="left"/>
+            </w:pPr>
+            <w:r>
+              <w:t xml:space="preserve">D</w:t>
+            </w:r>
+          </w:p>
+        </w:tc>
+        <w:tc>
+          <w:tcPr/>
+          <w:p>
+            <w:pPr>
+              <w:pStyle w:val="Compact"/>
+              <w:jc w:val="left"/>
+            </w:pPr>
+            <w:r>
+              <w:t xml:space="preserve">Invito a KOS per la call sulle correzioni Yext (proposta: martedì 9:00, 1 ora; se le due persone non possono, il primo orario utile entro mercoledì mattina e, nell'attesa, il foglio dei punti aperti con le risposte predefinite e la scadenza); account Meilisearch e progetto Google Cloud (15 minuti)</w:t>
+            </w:r>
+          </w:p>
+        </w:tc>
+      </w:tr>
+      <w:tr>
+        <w:tc>
+          <w:tcPr/>
+          <w:p>
+            <w:pPr>
+              <w:pStyle w:val="Compact"/>
+              <w:jc w:val="left"/>
+            </w:pPr>
+            <w:r>
               <w:t xml:space="preserve">9:00-10:00</w:t>
             </w:r>
           </w:p>
@@ -1973,29 +1786,135 @@
               <w:pStyle w:val="Compact"/>
               <w:jc w:val="left"/>
             </w:pPr>
+            <w:r>
+              <w:t xml:space="preserve">Stage su</w:t>
+            </w:r>
+            <w:r>
+              <w:t xml:space="preserve"> </w:t>
+            </w:r>
+            <w:r>
+              <w:rPr>
+                <w:rStyle w:val="VerbatimChar"/>
+              </w:rPr>
+              <w:t xml:space="preserve">stage.anniazzurri.it</w:t>
+            </w:r>
+            <w:r>
+              <w:t xml:space="preserve"> </w:t>
+            </w:r>
+            <w:r>
+              <w:t xml:space="preserve">e</w:t>
+            </w:r>
+            <w:r>
+              <w:t xml:space="preserve"> </w:t>
+            </w:r>
+            <w:r>
+              <w:rPr>
+                <w:rStyle w:val="VerbatimChar"/>
+              </w:rPr>
+              <w:t xml:space="preserve">stage.kosgroup.com</w:t>
+            </w:r>
+            <w:r>
+              <w:t xml:space="preserve">; filtri GTM per hostname</w:t>
+            </w:r>
+          </w:p>
+        </w:tc>
+      </w:tr>
+      <w:tr>
+        <w:tc>
+          <w:tcPr/>
+          <w:p>
+            <w:pPr>
+              <w:pStyle w:val="Compact"/>
+              <w:jc w:val="left"/>
+            </w:pPr>
+            <w:r>
+              <w:t xml:space="preserve">9:00-12:00</w:t>
+            </w:r>
+          </w:p>
+        </w:tc>
+        <w:tc>
+          <w:tcPr/>
+          <w:p>
+            <w:pPr>
+              <w:pStyle w:val="Compact"/>
+              <w:jc w:val="left"/>
+            </w:pPr>
+            <w:r>
+              <w:t xml:space="preserve">C</w:t>
+            </w:r>
+          </w:p>
+        </w:tc>
+        <w:tc>
+          <w:tcPr/>
+          <w:p>
+            <w:pPr>
+              <w:pStyle w:val="Compact"/>
+              <w:jc w:val="left"/>
+            </w:pPr>
+            <w:r>
+              <w:t xml:space="preserve">Ritocchi alle bozze del weekend; pacchetti AA 20 giro 2 e PDF (se servono) sullo stage; KOS-2 B sullo stage</w:t>
+            </w:r>
+          </w:p>
+        </w:tc>
+      </w:tr>
+      <w:tr>
+        <w:tc>
+          <w:tcPr/>
+          <w:p>
+            <w:pPr>
+              <w:pStyle w:val="Compact"/>
+              <w:jc w:val="left"/>
+            </w:pPr>
+            <w:r>
+              <w:t xml:space="preserve">10:00-12:00</w:t>
+            </w:r>
+          </w:p>
+        </w:tc>
+        <w:tc>
+          <w:tcPr/>
+          <w:p>
+            <w:pPr>
+              <w:pStyle w:val="Compact"/>
+              <w:jc w:val="left"/>
+            </w:pPr>
+            <w:r>
+              <w:t xml:space="preserve">D</w:t>
+            </w:r>
+          </w:p>
+        </w:tc>
+        <w:tc>
+          <w:tcPr/>
+          <w:p>
+            <w:pPr>
+              <w:pStyle w:val="Compact"/>
+              <w:jc w:val="left"/>
+            </w:pPr>
+            <w:r>
+              <w:t xml:space="preserve">Revisione finale e</w:t>
+            </w:r>
+            <w:r>
+              <w:t xml:space="preserve"> </w:t>
+            </w:r>
             <w:r>
               <w:rPr>
                 <w:bCs/>
                 <w:b/>
               </w:rPr>
-              <w:t xml:space="preserve">Call KOS</w:t>
-            </w:r>
-            <w:r>
-              <w:t xml:space="preserve">: Danilo chiede, KOS risponde; le risposte vanno nel foglio durante la call</w:t>
-            </w:r>
-          </w:p>
-        </w:tc>
-      </w:tr>
-      <w:tr>
-        <w:tc>
-          <w:tcPr/>
-          <w:p>
-            <w:pPr>
-              <w:pStyle w:val="Compact"/>
-              <w:jc w:val="left"/>
-            </w:pPr>
-            <w:r>
-              <w:t xml:space="preserve">10:00-12:00</w:t>
+              <w:t xml:space="preserve">primo invio a RetailTune</w:t>
+            </w:r>
+          </w:p>
+        </w:tc>
+      </w:tr>
+      <w:tr>
+        <w:tc>
+          <w:tcPr/>
+          <w:p>
+            <w:pPr>
+              <w:pStyle w:val="Compact"/>
+              <w:jc w:val="left"/>
+            </w:pPr>
+            <w:r>
+              <w:t xml:space="preserve">12:00-13:00</w:t>
             </w:r>
           </w:p>
         </w:tc>
@@ -2019,21 +1938,59 @@
               <w:jc w:val="left"/>
             </w:pPr>
             <w:r>
-              <w:t xml:space="preserve">Correzioni in Yext dalle risposte (o assegnate a KOS con scadenza mercoledì 12:00)</w:t>
-            </w:r>
-          </w:p>
-        </w:tc>
-      </w:tr>
-      <w:tr>
-        <w:tc>
-          <w:tcPr/>
-          <w:p>
-            <w:pPr>
-              <w:pStyle w:val="Compact"/>
-              <w:jc w:val="left"/>
-            </w:pPr>
-            <w:r>
-              <w:t xml:space="preserve">9:00-12:00</w:t>
+              <w:t xml:space="preserve">Collaudo sullo stage dei pacchetti della mattina</w:t>
+            </w:r>
+          </w:p>
+        </w:tc>
+      </w:tr>
+      <w:tr>
+        <w:tc>
+          <w:tcPr/>
+          <w:p>
+            <w:pPr>
+              <w:pStyle w:val="Compact"/>
+              <w:jc w:val="left"/>
+            </w:pPr>
+            <w:r>
+              <w:t xml:space="preserve">14:00-15:00</w:t>
+            </w:r>
+          </w:p>
+        </w:tc>
+        <w:tc>
+          <w:tcPr/>
+          <w:p>
+            <w:pPr>
+              <w:pStyle w:val="Compact"/>
+              <w:jc w:val="left"/>
+            </w:pPr>
+            <w:r>
+              <w:t xml:space="preserve">D</w:t>
+            </w:r>
+          </w:p>
+        </w:tc>
+        <w:tc>
+          <w:tcPr/>
+          <w:p>
+            <w:pPr>
+              <w:pStyle w:val="Compact"/>
+              <w:jc w:val="left"/>
+            </w:pPr>
+            <w:r>
+              <w:t xml:space="preserve">Rilascio in produzione: AA 20 giro 2, PDF, KOS-2 B</w:t>
+            </w:r>
+          </w:p>
+        </w:tc>
+      </w:tr>
+      <w:tr>
+        <w:tc>
+          <w:tcPr/>
+          <w:p>
+            <w:pPr>
+              <w:pStyle w:val="Compact"/>
+              <w:jc w:val="left"/>
+            </w:pPr>
+            <w:r>
+              <w:t xml:space="preserve">14:00-17:00</w:t>
             </w:r>
           </w:p>
         </w:tc>
@@ -2057,21 +2014,21 @@
               <w:jc w:val="left"/>
             </w:pPr>
             <w:r>
-              <w:t xml:space="preserve">Pacchetti AA 20 giro 2 e, se servono, PDF (KOS 8, AA 3) sullo stage; KOS-2 B (caricamento differito) sullo stage</w:t>
-            </w:r>
-          </w:p>
-        </w:tc>
-      </w:tr>
-      <w:tr>
-        <w:tc>
-          <w:tcPr/>
-          <w:p>
-            <w:pPr>
-              <w:pStyle w:val="Compact"/>
-              <w:jc w:val="left"/>
-            </w:pPr>
-            <w:r>
-              <w:t xml:space="preserve">12:00-13:00</w:t>
+              <w:t xml:space="preserve">Mail all'agenzia (categorie GBP + KOS 21-23 + 6 title lunghi AA) pronta; estensione dello script di verifica alle voci dello sprint 2 e 3</w:t>
+            </w:r>
+          </w:p>
+        </w:tc>
+      </w:tr>
+      <w:tr>
+        <w:tc>
+          <w:tcPr/>
+          <w:p>
+            <w:pPr>
+              <w:pStyle w:val="Compact"/>
+              <w:jc w:val="left"/>
+            </w:pPr>
+            <w:r>
+              <w:t xml:space="preserve">15:00-18:00</w:t>
             </w:r>
           </w:p>
         </w:tc>
@@ -2095,220 +2052,20 @@
               <w:jc w:val="left"/>
             </w:pPr>
             <w:r>
-              <w:t xml:space="preserve">Collaudo sullo stage dei pacchetti della mattina</w:t>
-            </w:r>
-          </w:p>
-        </w:tc>
-      </w:tr>
-      <w:tr>
-        <w:tc>
-          <w:tcPr/>
-          <w:p>
-            <w:pPr>
-              <w:pStyle w:val="Compact"/>
-              <w:jc w:val="left"/>
-            </w:pPr>
-            <w:r>
-              <w:t xml:space="preserve">14:00-15:00</w:t>
-            </w:r>
-          </w:p>
-        </w:tc>
-        <w:tc>
-          <w:tcPr/>
-          <w:p>
-            <w:pPr>
-              <w:pStyle w:val="Compact"/>
-              <w:jc w:val="left"/>
-            </w:pPr>
-            <w:r>
-              <w:t xml:space="preserve">D</w:t>
-            </w:r>
-          </w:p>
-        </w:tc>
-        <w:tc>
-          <w:tcPr/>
-          <w:p>
-            <w:pPr>
-              <w:pStyle w:val="Compact"/>
-              <w:jc w:val="left"/>
-            </w:pPr>
-            <w:r>
-              <w:t xml:space="preserve">Rilascio in produzione: AA 20 giro 2, PDF, KOS-2 B</w:t>
-            </w:r>
-          </w:p>
-        </w:tc>
-      </w:tr>
-      <w:tr>
-        <w:tc>
-          <w:tcPr/>
-          <w:p>
-            <w:pPr>
-              <w:pStyle w:val="Compact"/>
-              <w:jc w:val="left"/>
-            </w:pPr>
-            <w:r>
-              <w:t xml:space="preserve">14:00-16:00</w:t>
-            </w:r>
-          </w:p>
-        </w:tc>
-        <w:tc>
-          <w:tcPr/>
-          <w:p>
-            <w:pPr>
-              <w:pStyle w:val="Compact"/>
-              <w:jc w:val="left"/>
-            </w:pPr>
-            <w:r>
-              <w:t xml:space="preserve">C</w:t>
-            </w:r>
-          </w:p>
-        </w:tc>
-        <w:tc>
-          <w:tcPr/>
-          <w:p>
-            <w:pPr>
-              <w:pStyle w:val="Compact"/>
-              <w:jc w:val="left"/>
-            </w:pPr>
-            <w:r>
-              <w:t xml:space="preserve">Mail all'agenzia: proposta categorie GBP + proposta KOS 21-23 + 6 title lunghi AA, con validazione richiesta entro giovedì 5/11 12:00</w:t>
-            </w:r>
-          </w:p>
-        </w:tc>
-      </w:tr>
-      <w:tr>
-        <w:tc>
-          <w:tcPr/>
-          <w:p>
-            <w:pPr>
-              <w:pStyle w:val="Compact"/>
-              <w:jc w:val="left"/>
-            </w:pPr>
-            <w:r>
-              <w:t xml:space="preserve">16:00-16:30</w:t>
-            </w:r>
-          </w:p>
-        </w:tc>
-        <w:tc>
-          <w:tcPr/>
-          <w:p>
-            <w:pPr>
-              <w:pStyle w:val="Compact"/>
-              <w:jc w:val="left"/>
-            </w:pPr>
-            <w:r>
-              <w:t xml:space="preserve">D</w:t>
-            </w:r>
-          </w:p>
-        </w:tc>
-        <w:tc>
-          <w:tcPr/>
-          <w:p>
-            <w:pPr>
-              <w:pStyle w:val="Compact"/>
-              <w:jc w:val="left"/>
-            </w:pPr>
-            <w:r>
-              <w:t xml:space="preserve">Revisione e</w:t>
-            </w:r>
-            <w:r>
-              <w:t xml:space="preserve"> </w:t>
-            </w:r>
-            <w:r>
-              <w:rPr>
-                <w:bCs/>
-                <w:b/>
-              </w:rPr>
-              <w:t xml:space="preserve">invio della mail all'agenzia</w:t>
-            </w:r>
-          </w:p>
-        </w:tc>
-      </w:tr>
-      <w:tr>
-        <w:tc>
-          <w:tcPr/>
-          <w:p>
-            <w:pPr>
-              <w:pStyle w:val="Compact"/>
-              <w:jc w:val="left"/>
-            </w:pPr>
-            <w:r>
-              <w:t xml:space="preserve">14:00-18:30</w:t>
-            </w:r>
-          </w:p>
-        </w:tc>
-        <w:tc>
-          <w:tcPr/>
-          <w:p>
-            <w:pPr>
-              <w:pStyle w:val="Compact"/>
-              <w:jc w:val="left"/>
-            </w:pPr>
-            <w:r>
-              <w:t xml:space="preserve">C</w:t>
-            </w:r>
-          </w:p>
-        </w:tc>
-        <w:tc>
-          <w:tcPr/>
-          <w:p>
-            <w:pPr>
-              <w:pStyle w:val="Compact"/>
-              <w:jc w:val="left"/>
-            </w:pPr>
-            <w:r>
-              <w:t xml:space="preserve">Pacchetto RetailTune: tipologie, specifiche dei widget, corrispondenza dei campi, domande aperte</w:t>
-            </w:r>
-          </w:p>
-        </w:tc>
-      </w:tr>
-      <w:tr>
-        <w:tc>
-          <w:tcPr/>
-          <w:p>
-            <w:pPr>
-              <w:pStyle w:val="Compact"/>
-              <w:jc w:val="left"/>
-            </w:pPr>
-            <w:r>
-              <w:t xml:space="preserve">16:30-18:30</w:t>
-            </w:r>
-          </w:p>
-        </w:tc>
-        <w:tc>
-          <w:tcPr/>
-          <w:p>
-            <w:pPr>
-              <w:pStyle w:val="Compact"/>
-              <w:jc w:val="left"/>
-            </w:pPr>
-            <w:r>
-              <w:t xml:space="preserve">D</w:t>
-            </w:r>
-          </w:p>
-        </w:tc>
-        <w:tc>
-          <w:tcPr/>
-          <w:p>
-            <w:pPr>
-              <w:pStyle w:val="Compact"/>
-              <w:jc w:val="left"/>
-            </w:pPr>
-            <w:r>
-              <w:t xml:space="preserve">KOS 11 (parte tecnica): decisioni sulle pagine dei medici da esporre subito</w:t>
+              <w:t xml:space="preserve">Revisione della mail all'agenzia; KOS 11 (parte tecnica): decisioni sulle pagine dei medici da esporre subito</w:t>
             </w:r>
           </w:p>
         </w:tc>
       </w:tr>
     </w:tbl>
     <w:bookmarkEnd w:id="25"/>
-    <w:bookmarkStart w:id="26" w:name="X8f1dfa7040175622d26fd4fcebc4b5f9a36bb23"/>
+    <w:bookmarkStart w:id="26" w:name="martedì-311--call-kos-invio-allagenzia"/>
     <w:p>
       <w:pPr>
         <w:pStyle w:val="Heading3"/>
       </w:pPr>
       <w:r>
-        <w:t xml:space="preserve">Mercoledì 4/11 — sprint 3, call agenzia, pacchetto RetailTune</w:t>
+        <w:t xml:space="preserve">Martedì 3/11 — call KOS, invio all'agenzia</w:t>
       </w:r>
     </w:p>
     <w:tbl>
@@ -2373,121 +2130,7 @@
               <w:jc w:val="left"/>
             </w:pPr>
             <w:r>
-              <w:t xml:space="preserve">9:00-12:00</w:t>
-            </w:r>
-          </w:p>
-        </w:tc>
-        <w:tc>
-          <w:tcPr/>
-          <w:p>
-            <w:pPr>
-              <w:pStyle w:val="Compact"/>
-              <w:jc w:val="left"/>
-            </w:pPr>
-            <w:r>
-              <w:t xml:space="preserve">C</w:t>
-            </w:r>
-          </w:p>
-        </w:tc>
-        <w:tc>
-          <w:tcPr/>
-          <w:p>
-            <w:pPr>
-              <w:pStyle w:val="Compact"/>
-              <w:jc w:val="left"/>
-            </w:pPr>
-            <w:r>
-              <w:t xml:space="preserve">KOS 10 (Article con autore ed editore) e alt mancanti (KOS 7, AA 9) sullo stage; AA 4 misura e correzione della stabilità visiva</w:t>
-            </w:r>
-          </w:p>
-        </w:tc>
-      </w:tr>
-      <w:tr>
-        <w:tc>
-          <w:tcPr/>
-          <w:p>
-            <w:pPr>
-              <w:pStyle w:val="Compact"/>
-              <w:jc w:val="left"/>
-            </w:pPr>
-            <w:r>
-              <w:t xml:space="preserve">9:00-11:00</w:t>
-            </w:r>
-          </w:p>
-        </w:tc>
-        <w:tc>
-          <w:tcPr/>
-          <w:p>
-            <w:pPr>
-              <w:pStyle w:val="Compact"/>
-              <w:jc w:val="left"/>
-            </w:pPr>
-            <w:r>
-              <w:t xml:space="preserve">D</w:t>
-            </w:r>
-          </w:p>
-        </w:tc>
-        <w:tc>
-          <w:tcPr/>
-          <w:p>
-            <w:pPr>
-              <w:pStyle w:val="Compact"/>
-              <w:jc w:val="left"/>
-            </w:pPr>
-            <w:r>
-              <w:t xml:space="preserve">Proposte degli alt da validare; controllo che le correzioni Yext siano fatte (scadenza 12:00)</w:t>
-            </w:r>
-          </w:p>
-        </w:tc>
-      </w:tr>
-      <w:tr>
-        <w:tc>
-          <w:tcPr/>
-          <w:p>
-            <w:pPr>
-              <w:pStyle w:val="Compact"/>
-              <w:jc w:val="left"/>
-            </w:pPr>
-            <w:r>
-              <w:t xml:space="preserve">11:00-12:00</w:t>
-            </w:r>
-          </w:p>
-        </w:tc>
-        <w:tc>
-          <w:tcPr/>
-          <w:p>
-            <w:pPr>
-              <w:pStyle w:val="Compact"/>
-              <w:jc w:val="left"/>
-            </w:pPr>
-            <w:r>
-              <w:t xml:space="preserve">D</w:t>
-            </w:r>
-          </w:p>
-        </w:tc>
-        <w:tc>
-          <w:tcPr/>
-          <w:p>
-            <w:pPr>
-              <w:pStyle w:val="Compact"/>
-              <w:jc w:val="left"/>
-            </w:pPr>
-            <w:r>
-              <w:t xml:space="preserve">Preparazione della call con l'agenzia (riscontro sulle categorie, finestra di verifica, testi KOS)</w:t>
-            </w:r>
-          </w:p>
-        </w:tc>
-      </w:tr>
-      <w:tr>
-        <w:tc>
-          <w:tcPr/>
-          <w:p>
-            <w:pPr>
-              <w:pStyle w:val="Compact"/>
-              <w:jc w:val="left"/>
-            </w:pPr>
-            <w:r>
-              <w:t xml:space="preserve">12:00-13:00</w:t>
+              <w:t xml:space="preserve">9:00-10:00</w:t>
             </w:r>
           </w:p>
         </w:tc>
@@ -2515,27 +2158,103 @@
                 <w:bCs/>
                 <w:b/>
               </w:rPr>
-              <w:t xml:space="preserve">Export Yext corretto</w:t>
+              <w:t xml:space="preserve">Call KOS</w:t>
             </w:r>
             <w:r>
               <w:t xml:space="preserve"> </w:t>
             </w:r>
             <w:r>
-              <w:t xml:space="preserve">(se le correzioni sono chiuse)</w:t>
-            </w:r>
-          </w:p>
-        </w:tc>
-      </w:tr>
-      <w:tr>
-        <w:tc>
-          <w:tcPr/>
-          <w:p>
-            <w:pPr>
-              <w:pStyle w:val="Compact"/>
-              <w:jc w:val="left"/>
-            </w:pPr>
-            <w:r>
-              <w:t xml:space="preserve">14:00-14:30</w:t>
+              <w:t xml:space="preserve">(se confermata): Danilo chiede, KOS risponde; le risposte vanno nel foglio durante la call</w:t>
+            </w:r>
+          </w:p>
+        </w:tc>
+      </w:tr>
+      <w:tr>
+        <w:tc>
+          <w:tcPr/>
+          <w:p>
+            <w:pPr>
+              <w:pStyle w:val="Compact"/>
+              <w:jc w:val="left"/>
+            </w:pPr>
+            <w:r>
+              <w:t xml:space="preserve">10:00-12:00</w:t>
+            </w:r>
+          </w:p>
+        </w:tc>
+        <w:tc>
+          <w:tcPr/>
+          <w:p>
+            <w:pPr>
+              <w:pStyle w:val="Compact"/>
+              <w:jc w:val="left"/>
+            </w:pPr>
+            <w:r>
+              <w:t xml:space="preserve">D</w:t>
+            </w:r>
+          </w:p>
+        </w:tc>
+        <w:tc>
+          <w:tcPr/>
+          <w:p>
+            <w:pPr>
+              <w:pStyle w:val="Compact"/>
+              <w:jc w:val="left"/>
+            </w:pPr>
+            <w:r>
+              <w:t xml:space="preserve">Correzioni in Yext dalle risposte (o assegnate a KOS con scadenza mercoledì 12:00)</w:t>
+            </w:r>
+          </w:p>
+        </w:tc>
+      </w:tr>
+      <w:tr>
+        <w:tc>
+          <w:tcPr/>
+          <w:p>
+            <w:pPr>
+              <w:pStyle w:val="Compact"/>
+              <w:jc w:val="left"/>
+            </w:pPr>
+            <w:r>
+              <w:t xml:space="preserve">9:00-12:00</w:t>
+            </w:r>
+          </w:p>
+        </w:tc>
+        <w:tc>
+          <w:tcPr/>
+          <w:p>
+            <w:pPr>
+              <w:pStyle w:val="Compact"/>
+              <w:jc w:val="left"/>
+            </w:pPr>
+            <w:r>
+              <w:t xml:space="preserve">C</w:t>
+            </w:r>
+          </w:p>
+        </w:tc>
+        <w:tc>
+          <w:tcPr/>
+          <w:p>
+            <w:pPr>
+              <w:pStyle w:val="Compact"/>
+              <w:jc w:val="left"/>
+            </w:pPr>
+            <w:r>
+              <w:t xml:space="preserve">KOS 10 (Article con autore ed editore) sullo stage; alt mancanti (KOS 7, AA 9): proposte</w:t>
+            </w:r>
+          </w:p>
+        </w:tc>
+      </w:tr>
+      <w:tr>
+        <w:tc>
+          <w:tcPr/>
+          <w:p>
+            <w:pPr>
+              <w:pStyle w:val="Compact"/>
+              <w:jc w:val="left"/>
+            </w:pPr>
+            <w:r>
+              <w:t xml:space="preserve">12:00-13:00</w:t>
             </w:r>
           </w:p>
         </w:tc>
@@ -2563,21 +2282,27 @@
                 <w:bCs/>
                 <w:b/>
               </w:rPr>
-              <w:t xml:space="preserve">Call con l'agenzia</w:t>
-            </w:r>
-          </w:p>
-        </w:tc>
-      </w:tr>
-      <w:tr>
-        <w:tc>
-          <w:tcPr/>
-          <w:p>
-            <w:pPr>
-              <w:pStyle w:val="Compact"/>
-              <w:jc w:val="left"/>
-            </w:pPr>
-            <w:r>
-              <w:t xml:space="preserve">13:00-17:00</w:t>
+              <w:t xml:space="preserve">Invio della mail all'agenzia</w:t>
+            </w:r>
+            <w:r>
+              <w:t xml:space="preserve"> </w:t>
+            </w:r>
+            <w:r>
+              <w:t xml:space="preserve">(categorie GBP, testi KOS 21-23, 6 title lunghi AA; validazione entro giovedì 5/11 12:00)</w:t>
+            </w:r>
+          </w:p>
+        </w:tc>
+      </w:tr>
+      <w:tr>
+        <w:tc>
+          <w:tcPr/>
+          <w:p>
+            <w:pPr>
+              <w:pStyle w:val="Compact"/>
+              <w:jc w:val="left"/>
+            </w:pPr>
+            <w:r>
+              <w:t xml:space="preserve">14:00-17:00</w:t>
             </w:r>
           </w:p>
         </w:tc>
@@ -2601,21 +2326,21 @@
               <w:jc w:val="left"/>
             </w:pPr>
             <w:r>
-              <w:t xml:space="preserve">Dall'export: report delle differenze sulle TV KOS e confronto a tre (sito, Yext, Google); elenco sedi per RetailTune</w:t>
-            </w:r>
-          </w:p>
-        </w:tc>
-      </w:tr>
-      <w:tr>
-        <w:tc>
-          <w:tcPr/>
-          <w:p>
-            <w:pPr>
-              <w:pStyle w:val="Compact"/>
-              <w:jc w:val="left"/>
-            </w:pPr>
-            <w:r>
-              <w:t xml:space="preserve">14:30-16:00</w:t>
+              <w:t xml:space="preserve">Dati dell'export Yext attuale nel formato del secondo invio, così il giorno dell'export corretto basta rilanciare; AA 4 misura della stabilità visiva</w:t>
+            </w:r>
+          </w:p>
+        </w:tc>
+      </w:tr>
+      <w:tr>
+        <w:tc>
+          <w:tcPr/>
+          <w:p>
+            <w:pPr>
+              <w:pStyle w:val="Compact"/>
+              <w:jc w:val="left"/>
+            </w:pPr>
+            <w:r>
+              <w:t xml:space="preserve">14:00-16:00</w:t>
             </w:r>
           </w:p>
         </w:tc>
@@ -2639,7 +2364,7 @@
               <w:jc w:val="left"/>
             </w:pPr>
             <w:r>
-              <w:t xml:space="preserve">Correzioni alle categorie dalla call; collaudo di KOS 10 e alt sullo stage</w:t>
+              <w:t xml:space="preserve">Validazione degli alt; collaudo di KOS 10 sullo stage</w:t>
             </w:r>
           </w:p>
         </w:tc>
@@ -2677,7 +2402,7 @@
               <w:jc w:val="left"/>
             </w:pPr>
             <w:r>
-              <w:t xml:space="preserve">Rilascio in produzione: KOS 10, alt, AA 4</w:t>
+              <w:t xml:space="preserve">Rilascio in produzione: KOS 10, alt</w:t>
             </w:r>
           </w:p>
         </w:tc>
@@ -2703,36 +2428,32 @@
               <w:jc w:val="left"/>
             </w:pPr>
             <w:r>
-              <w:t xml:space="preserve">C+D</w:t>
-            </w:r>
-          </w:p>
-        </w:tc>
-        <w:tc>
-          <w:tcPr/>
-          <w:p>
-            <w:pPr>
-              <w:pStyle w:val="Compact"/>
-              <w:jc w:val="left"/>
-            </w:pPr>
-            <w:r>
-              <w:rPr>
-                <w:bCs/>
-                <w:b/>
-              </w:rPr>
-              <w:t xml:space="preserve">Invio del pacchetto a RetailTune</w:t>
+              <w:t xml:space="preserve">D</w:t>
+            </w:r>
+          </w:p>
+        </w:tc>
+        <w:tc>
+          <w:tcPr/>
+          <w:p>
+            <w:pPr>
+              <w:pStyle w:val="Compact"/>
+              <w:jc w:val="left"/>
+            </w:pPr>
+            <w:r>
+              <w:t xml:space="preserve">Margine; risposte di RetailTune al primo invio</w:t>
             </w:r>
           </w:p>
         </w:tc>
       </w:tr>
     </w:tbl>
     <w:bookmarkEnd w:id="26"/>
-    <w:bookmarkStart w:id="27" w:name="X0ba5fee1155f9208a9d5caf157f73f0b5b98cc3"/>
+    <w:bookmarkStart w:id="27" w:name="X8f1dfa7040175622d26fd4fcebc4b5f9a36bb23"/>
     <w:p>
       <w:pPr>
         <w:pStyle w:val="Heading3"/>
       </w:pPr>
       <w:r>
-        <w:t xml:space="preserve">Giovedì 5/11 — kickoff RetailTune, import dei dati</w:t>
+        <w:t xml:space="preserve">Mercoledì 4/11 — sprint 3, call agenzia, pacchetto RetailTune</w:t>
       </w:r>
     </w:p>
     <w:tbl>
@@ -2797,7 +2518,121 @@
               <w:jc w:val="left"/>
             </w:pPr>
             <w:r>
-              <w:t xml:space="preserve">mattina</w:t>
+              <w:t xml:space="preserve">9:00-12:00</w:t>
+            </w:r>
+          </w:p>
+        </w:tc>
+        <w:tc>
+          <w:tcPr/>
+          <w:p>
+            <w:pPr>
+              <w:pStyle w:val="Compact"/>
+              <w:jc w:val="left"/>
+            </w:pPr>
+            <w:r>
+              <w:t xml:space="preserve">C</w:t>
+            </w:r>
+          </w:p>
+        </w:tc>
+        <w:tc>
+          <w:tcPr/>
+          <w:p>
+            <w:pPr>
+              <w:pStyle w:val="Compact"/>
+              <w:jc w:val="left"/>
+            </w:pPr>
+            <w:r>
+              <w:t xml:space="preserve">AA 4 correzione della stabilità visiva sullo stage; TV anagrafiche AA sullo stage</w:t>
+            </w:r>
+          </w:p>
+        </w:tc>
+      </w:tr>
+      <w:tr>
+        <w:tc>
+          <w:tcPr/>
+          <w:p>
+            <w:pPr>
+              <w:pStyle w:val="Compact"/>
+              <w:jc w:val="left"/>
+            </w:pPr>
+            <w:r>
+              <w:t xml:space="preserve">9:00-11:00</w:t>
+            </w:r>
+          </w:p>
+        </w:tc>
+        <w:tc>
+          <w:tcPr/>
+          <w:p>
+            <w:pPr>
+              <w:pStyle w:val="Compact"/>
+              <w:jc w:val="left"/>
+            </w:pPr>
+            <w:r>
+              <w:t xml:space="preserve">D</w:t>
+            </w:r>
+          </w:p>
+        </w:tc>
+        <w:tc>
+          <w:tcPr/>
+          <w:p>
+            <w:pPr>
+              <w:pStyle w:val="Compact"/>
+              <w:jc w:val="left"/>
+            </w:pPr>
+            <w:r>
+              <w:t xml:space="preserve">Controllo che le correzioni Yext siano fatte (scadenza 12:00); collaudo di AA 4 sullo stage</w:t>
+            </w:r>
+          </w:p>
+        </w:tc>
+      </w:tr>
+      <w:tr>
+        <w:tc>
+          <w:tcPr/>
+          <w:p>
+            <w:pPr>
+              <w:pStyle w:val="Compact"/>
+              <w:jc w:val="left"/>
+            </w:pPr>
+            <w:r>
+              <w:t xml:space="preserve">11:00-12:00</w:t>
+            </w:r>
+          </w:p>
+        </w:tc>
+        <w:tc>
+          <w:tcPr/>
+          <w:p>
+            <w:pPr>
+              <w:pStyle w:val="Compact"/>
+              <w:jc w:val="left"/>
+            </w:pPr>
+            <w:r>
+              <w:t xml:space="preserve">D</w:t>
+            </w:r>
+          </w:p>
+        </w:tc>
+        <w:tc>
+          <w:tcPr/>
+          <w:p>
+            <w:pPr>
+              <w:pStyle w:val="Compact"/>
+              <w:jc w:val="left"/>
+            </w:pPr>
+            <w:r>
+              <w:t xml:space="preserve">Preparazione della call con l'agenzia (riscontro sulle categorie, finestra di verifica, testi KOS)</w:t>
+            </w:r>
+          </w:p>
+        </w:tc>
+      </w:tr>
+      <w:tr>
+        <w:tc>
+          <w:tcPr/>
+          <w:p>
+            <w:pPr>
+              <w:pStyle w:val="Compact"/>
+              <w:jc w:val="left"/>
+            </w:pPr>
+            <w:r>
+              <w:t xml:space="preserve">12:00-13:00</w:t>
             </w:r>
           </w:p>
         </w:tc>
@@ -2825,21 +2660,69 @@
                 <w:bCs/>
                 <w:b/>
               </w:rPr>
-              <w:t xml:space="preserve">Kickoff RetailTune</w:t>
-            </w:r>
-          </w:p>
-        </w:tc>
-      </w:tr>
-      <w:tr>
-        <w:tc>
-          <w:tcPr/>
-          <w:p>
-            <w:pPr>
-              <w:pStyle w:val="Compact"/>
-              <w:jc w:val="left"/>
-            </w:pPr>
-            <w:r>
-              <w:t xml:space="preserve">9:00-12:00</w:t>
+              <w:t xml:space="preserve">Export Yext corretto</w:t>
+            </w:r>
+            <w:r>
+              <w:t xml:space="preserve"> </w:t>
+            </w:r>
+            <w:r>
+              <w:t xml:space="preserve">(se le correzioni sono chiuse)</w:t>
+            </w:r>
+          </w:p>
+        </w:tc>
+      </w:tr>
+      <w:tr>
+        <w:tc>
+          <w:tcPr/>
+          <w:p>
+            <w:pPr>
+              <w:pStyle w:val="Compact"/>
+              <w:jc w:val="left"/>
+            </w:pPr>
+            <w:r>
+              <w:t xml:space="preserve">14:00-14:30</w:t>
+            </w:r>
+          </w:p>
+        </w:tc>
+        <w:tc>
+          <w:tcPr/>
+          <w:p>
+            <w:pPr>
+              <w:pStyle w:val="Compact"/>
+              <w:jc w:val="left"/>
+            </w:pPr>
+            <w:r>
+              <w:t xml:space="preserve">D</w:t>
+            </w:r>
+          </w:p>
+        </w:tc>
+        <w:tc>
+          <w:tcPr/>
+          <w:p>
+            <w:pPr>
+              <w:pStyle w:val="Compact"/>
+              <w:jc w:val="left"/>
+            </w:pPr>
+            <w:r>
+              <w:rPr>
+                <w:bCs/>
+                <w:b/>
+              </w:rPr>
+              <w:t xml:space="preserve">Call con l'agenzia</w:t>
+            </w:r>
+          </w:p>
+        </w:tc>
+      </w:tr>
+      <w:tr>
+        <w:tc>
+          <w:tcPr/>
+          <w:p>
+            <w:pPr>
+              <w:pStyle w:val="Compact"/>
+              <w:jc w:val="left"/>
+            </w:pPr>
+            <w:r>
+              <w:t xml:space="preserve">13:00-17:00</w:t>
             </w:r>
           </w:p>
         </w:tc>
@@ -2863,222 +2746,144 @@
               <w:jc w:val="left"/>
             </w:pPr>
             <w:r>
-              <w:t xml:space="preserve">Import delle TV anagrafiche sullo stage (KOS</w:t>
+              <w:t xml:space="preserve">Dall'export: report delle differenze sulle TV KOS e confronto a tre (sito, Yext, Google); elenco sedi per RetailTune</w:t>
+            </w:r>
+          </w:p>
+        </w:tc>
+      </w:tr>
+      <w:tr>
+        <w:tc>
+          <w:tcPr/>
+          <w:p>
+            <w:pPr>
+              <w:pStyle w:val="Compact"/>
+              <w:jc w:val="left"/>
+            </w:pPr>
+            <w:r>
+              <w:t xml:space="preserve">14:30-16:00</w:t>
+            </w:r>
+          </w:p>
+        </w:tc>
+        <w:tc>
+          <w:tcPr/>
+          <w:p>
+            <w:pPr>
+              <w:pStyle w:val="Compact"/>
+              <w:jc w:val="left"/>
+            </w:pPr>
+            <w:r>
+              <w:t xml:space="preserve">D</w:t>
+            </w:r>
+          </w:p>
+        </w:tc>
+        <w:tc>
+          <w:tcPr/>
+          <w:p>
+            <w:pPr>
+              <w:pStyle w:val="Compact"/>
+              <w:jc w:val="left"/>
+            </w:pPr>
+            <w:r>
+              <w:t xml:space="preserve">Correzioni alle categorie dalla call</w:t>
+            </w:r>
+          </w:p>
+        </w:tc>
+      </w:tr>
+      <w:tr>
+        <w:tc>
+          <w:tcPr/>
+          <w:p>
+            <w:pPr>
+              <w:pStyle w:val="Compact"/>
+              <w:jc w:val="left"/>
+            </w:pPr>
+            <w:r>
+              <w:t xml:space="preserve">16:00-17:00</w:t>
+            </w:r>
+          </w:p>
+        </w:tc>
+        <w:tc>
+          <w:tcPr/>
+          <w:p>
+            <w:pPr>
+              <w:pStyle w:val="Compact"/>
+              <w:jc w:val="left"/>
+            </w:pPr>
+            <w:r>
+              <w:t xml:space="preserve">D</w:t>
+            </w:r>
+          </w:p>
+        </w:tc>
+        <w:tc>
+          <w:tcPr/>
+          <w:p>
+            <w:pPr>
+              <w:pStyle w:val="Compact"/>
+              <w:jc w:val="left"/>
+            </w:pPr>
+            <w:r>
+              <w:t xml:space="preserve">Rilascio in produzione: AA 4</w:t>
+            </w:r>
+          </w:p>
+        </w:tc>
+      </w:tr>
+      <w:tr>
+        <w:tc>
+          <w:tcPr/>
+          <w:p>
+            <w:pPr>
+              <w:pStyle w:val="Compact"/>
+              <w:jc w:val="left"/>
+            </w:pPr>
+            <w:r>
+              <w:t xml:space="preserve">17:00-18:30</w:t>
+            </w:r>
+          </w:p>
+        </w:tc>
+        <w:tc>
+          <w:tcPr/>
+          <w:p>
+            <w:pPr>
+              <w:pStyle w:val="Compact"/>
+              <w:jc w:val="left"/>
+            </w:pPr>
+            <w:r>
+              <w:t xml:space="preserve">C+D</w:t>
+            </w:r>
+          </w:p>
+        </w:tc>
+        <w:tc>
+          <w:tcPr/>
+          <w:p>
+            <w:pPr>
+              <w:pStyle w:val="Compact"/>
+              <w:jc w:val="left"/>
+            </w:pPr>
+            <w:r>
+              <w:rPr>
+                <w:bCs/>
+                <w:b/>
+              </w:rPr>
+              <w:t xml:space="preserve">Secondo invio a RetailTune</w:t>
             </w:r>
             <w:r>
               <w:t xml:space="preserve"> </w:t>
             </w:r>
             <w:r>
-              <w:rPr>
-                <w:rStyle w:val="VerbatimChar"/>
-              </w:rPr>
-              <w:t xml:space="preserve">str.*</w:t>
-            </w:r>
-            <w:r>
-              <w:t xml:space="preserve">, AA nuove TV); KOS 24 attivazione sullo stage; AA 2, 5, 11, 21 e AA 10 sullo stage</w:t>
-            </w:r>
-          </w:p>
-        </w:tc>
-      </w:tr>
-      <w:tr>
-        <w:tc>
-          <w:tcPr/>
-          <w:p>
-            <w:pPr>
-              <w:pStyle w:val="Compact"/>
-              <w:jc w:val="left"/>
-            </w:pPr>
-            <w:r>
-              <w:t xml:space="preserve">12:00-13:00</w:t>
-            </w:r>
-          </w:p>
-        </w:tc>
-        <w:tc>
-          <w:tcPr/>
-          <w:p>
-            <w:pPr>
-              <w:pStyle w:val="Compact"/>
-              <w:jc w:val="left"/>
-            </w:pPr>
-            <w:r>
-              <w:t xml:space="preserve">D</w:t>
-            </w:r>
-          </w:p>
-        </w:tc>
-        <w:tc>
-          <w:tcPr/>
-          <w:p>
-            <w:pPr>
-              <w:pStyle w:val="Compact"/>
-              <w:jc w:val="left"/>
-            </w:pPr>
-            <w:r>
-              <w:t xml:space="preserve">Controllo delle validazioni dell'agenzia (KOS 21-23, title AA lunghi)</w:t>
-            </w:r>
-          </w:p>
-        </w:tc>
-      </w:tr>
-      <w:tr>
-        <w:tc>
-          <w:tcPr/>
-          <w:p>
-            <w:pPr>
-              <w:pStyle w:val="Compact"/>
-              <w:jc w:val="left"/>
-            </w:pPr>
-            <w:r>
-              <w:t xml:space="preserve">14:00-16:00</w:t>
-            </w:r>
-          </w:p>
-        </w:tc>
-        <w:tc>
-          <w:tcPr/>
-          <w:p>
-            <w:pPr>
-              <w:pStyle w:val="Compact"/>
-              <w:jc w:val="left"/>
-            </w:pPr>
-            <w:r>
-              <w:t xml:space="preserve">D</w:t>
-            </w:r>
-          </w:p>
-        </w:tc>
-        <w:tc>
-          <w:tcPr/>
-          <w:p>
-            <w:pPr>
-              <w:pStyle w:val="Compact"/>
-              <w:jc w:val="left"/>
-            </w:pPr>
-            <w:r>
-              <w:t xml:space="preserve">Collaudo sullo stage: schede KOS e AA, pagine provincia, confronto prima/dopo</w:t>
-            </w:r>
-          </w:p>
-        </w:tc>
-      </w:tr>
-      <w:tr>
-        <w:tc>
-          <w:tcPr/>
-          <w:p>
-            <w:pPr>
-              <w:pStyle w:val="Compact"/>
-              <w:jc w:val="left"/>
-            </w:pPr>
-            <w:r>
-              <w:t xml:space="preserve">14:00-16:00</w:t>
-            </w:r>
-          </w:p>
-        </w:tc>
-        <w:tc>
-          <w:tcPr/>
-          <w:p>
-            <w:pPr>
-              <w:pStyle w:val="Compact"/>
-              <w:jc w:val="left"/>
-            </w:pPr>
-            <w:r>
-              <w:t xml:space="preserve">C</w:t>
-            </w:r>
-          </w:p>
-        </w:tc>
-        <w:tc>
-          <w:tcPr/>
-          <w:p>
-            <w:pPr>
-              <w:pStyle w:val="Compact"/>
-              <w:jc w:val="left"/>
-            </w:pPr>
-            <w:r>
-              <w:t xml:space="preserve">Pacchetto KOS 21-23 (testi validati) e marchio « | KOS» sullo stage</w:t>
-            </w:r>
-          </w:p>
-        </w:tc>
-      </w:tr>
-      <w:tr>
-        <w:tc>
-          <w:tcPr/>
-          <w:p>
-            <w:pPr>
-              <w:pStyle w:val="Compact"/>
-              <w:jc w:val="left"/>
-            </w:pPr>
-            <w:r>
-              <w:t xml:space="preserve">16:00-17:30</w:t>
-            </w:r>
-          </w:p>
-        </w:tc>
-        <w:tc>
-          <w:tcPr/>
-          <w:p>
-            <w:pPr>
-              <w:pStyle w:val="Compact"/>
-              <w:jc w:val="left"/>
-            </w:pPr>
-            <w:r>
-              <w:t xml:space="preserve">D</w:t>
-            </w:r>
-          </w:p>
-        </w:tc>
-        <w:tc>
-          <w:tcPr/>
-          <w:p>
-            <w:pPr>
-              <w:pStyle w:val="Compact"/>
-              <w:jc w:val="left"/>
-            </w:pPr>
-            <w:r>
-              <w:t xml:space="preserve">Rilascio in produzione: import TV, KOS 24, KOS 21-23</w:t>
-            </w:r>
-          </w:p>
-        </w:tc>
-      </w:tr>
-      <w:tr>
-        <w:tc>
-          <w:tcPr/>
-          <w:p>
-            <w:pPr>
-              <w:pStyle w:val="Compact"/>
-              <w:jc w:val="left"/>
-            </w:pPr>
-            <w:r>
-              <w:t xml:space="preserve">17:30-18:30</w:t>
-            </w:r>
-          </w:p>
-        </w:tc>
-        <w:tc>
-          <w:tcPr/>
-          <w:p>
-            <w:pPr>
-              <w:pStyle w:val="Compact"/>
-              <w:jc w:val="left"/>
-            </w:pPr>
-            <w:r>
-              <w:t xml:space="preserve">C</w:t>
-            </w:r>
-          </w:p>
-        </w:tc>
-        <w:tc>
-          <w:tcPr/>
-          <w:p>
-            <w:pPr>
-              <w:pStyle w:val="Compact"/>
-              <w:jc w:val="left"/>
-            </w:pPr>
-            <w:r>
-              <w:t xml:space="preserve">Controllo in produzione dei rilasci del giorno (cache rigenerata, un solo JSON-LD, schede)</w:t>
+              <w:t xml:space="preserve">(sedi e categorie definitive), se l'export è arrivato; altrimenti giovedì</w:t>
             </w:r>
           </w:p>
         </w:tc>
       </w:tr>
     </w:tbl>
     <w:bookmarkEnd w:id="27"/>
-    <w:bookmarkStart w:id="28" w:name="Xe7e79408a4ed13ae5ad4c712997a64652aebe43"/>
+    <w:bookmarkStart w:id="28" w:name="X7de954f4b07d14870ac9711b8036516c1e393f1"/>
     <w:p>
       <w:pPr>
         <w:pStyle w:val="Heading3"/>
       </w:pPr>
       <w:r>
-        <w:t xml:space="preserve">Venerdì 6/11 — ultimi rilasci, verifica, consegna pronta</w:t>
+        <w:t xml:space="preserve">Giovedì 5/11 — partenza RetailTune, import dei dati</w:t>
       </w:r>
     </w:p>
     <w:tbl>
@@ -3143,7 +2948,7 @@
               <w:jc w:val="left"/>
             </w:pPr>
             <w:r>
-              <w:t xml:space="preserve">9:00-11:00</w:t>
+              <w:t xml:space="preserve">mattina</w:t>
             </w:r>
           </w:p>
         </w:tc>
@@ -3167,69 +2972,71 @@
               <w:jc w:val="left"/>
             </w:pPr>
             <w:r>
-              <w:t xml:space="preserve">Rilascio in produzione: AA schede (2, 5, 11, 21) e pagine provincia (AA 10), se il collaudo di giovedì è passato</w:t>
-            </w:r>
-          </w:p>
-        </w:tc>
-      </w:tr>
-      <w:tr>
-        <w:tc>
-          <w:tcPr/>
-          <w:p>
-            <w:pPr>
-              <w:pStyle w:val="Compact"/>
-              <w:jc w:val="left"/>
-            </w:pPr>
-            <w:r>
-              <w:t xml:space="preserve">11:00-13:00</w:t>
-            </w:r>
-          </w:p>
-        </w:tc>
-        <w:tc>
-          <w:tcPr/>
-          <w:p>
-            <w:pPr>
-              <w:pStyle w:val="Compact"/>
-              <w:jc w:val="left"/>
-            </w:pPr>
-            <w:r>
-              <w:t xml:space="preserve">C+D</w:t>
-            </w:r>
-          </w:p>
-        </w:tc>
-        <w:tc>
-          <w:tcPr/>
-          <w:p>
-            <w:pPr>
-              <w:pStyle w:val="Compact"/>
-              <w:jc w:val="left"/>
-            </w:pPr>
-            <w:r>
-              <w:t xml:space="preserve">Correzioni dell'ultimo minuto;</w:t>
+              <w:t xml:space="preserve">Partenza RetailTune: risposte e richieste del fornitore; secondo invio se non è partito mercoledì</w:t>
+            </w:r>
+          </w:p>
+        </w:tc>
+      </w:tr>
+      <w:tr>
+        <w:tc>
+          <w:tcPr/>
+          <w:p>
+            <w:pPr>
+              <w:pStyle w:val="Compact"/>
+              <w:jc w:val="left"/>
+            </w:pPr>
+            <w:r>
+              <w:t xml:space="preserve">9:00-12:00</w:t>
+            </w:r>
+          </w:p>
+        </w:tc>
+        <w:tc>
+          <w:tcPr/>
+          <w:p>
+            <w:pPr>
+              <w:pStyle w:val="Compact"/>
+              <w:jc w:val="left"/>
+            </w:pPr>
+            <w:r>
+              <w:t xml:space="preserve">C</w:t>
+            </w:r>
+          </w:p>
+        </w:tc>
+        <w:tc>
+          <w:tcPr/>
+          <w:p>
+            <w:pPr>
+              <w:pStyle w:val="Compact"/>
+              <w:jc w:val="left"/>
+            </w:pPr>
+            <w:r>
+              <w:t xml:space="preserve">Import delle TV anagrafiche sullo stage (KOS</w:t>
             </w:r>
             <w:r>
               <w:t xml:space="preserve"> </w:t>
             </w:r>
             <w:r>
               <w:rPr>
-                <w:bCs/>
-                <w:b/>
+                <w:rStyle w:val="VerbatimChar"/>
               </w:rPr>
-              <w:t xml:space="preserve">13:00 ultimo rilascio</w:t>
-            </w:r>
-          </w:p>
-        </w:tc>
-      </w:tr>
-      <w:tr>
-        <w:tc>
-          <w:tcPr/>
-          <w:p>
-            <w:pPr>
-              <w:pStyle w:val="Compact"/>
-              <w:jc w:val="left"/>
-            </w:pPr>
-            <w:r>
-              <w:t xml:space="preserve">13:00-14:00</w:t>
+              <w:t xml:space="preserve">str.*</w:t>
+            </w:r>
+            <w:r>
+              <w:t xml:space="preserve">, AA nuove TV); KOS 24 attivazione sullo stage; AA 2, 5, 11, 21 e AA 10 sullo stage</w:t>
+            </w:r>
+          </w:p>
+        </w:tc>
+      </w:tr>
+      <w:tr>
+        <w:tc>
+          <w:tcPr/>
+          <w:p>
+            <w:pPr>
+              <w:pStyle w:val="Compact"/>
+              <w:jc w:val="left"/>
+            </w:pPr>
+            <w:r>
+              <w:t xml:space="preserve">12:00-13:00</w:t>
             </w:r>
           </w:p>
         </w:tc>
@@ -3253,7 +3060,7 @@
               <w:jc w:val="left"/>
             </w:pPr>
             <w:r>
-              <w:t xml:space="preserve">Verifica completa in produzione (script esteso), conservata come contro-prova</w:t>
+              <w:t xml:space="preserve">Controllo delle validazioni dell'agenzia (KOS 21-23, title AA lunghi)</w:t>
             </w:r>
           </w:p>
         </w:tc>
@@ -3279,6 +3086,44 @@
               <w:jc w:val="left"/>
             </w:pPr>
             <w:r>
+              <w:t xml:space="preserve">D</w:t>
+            </w:r>
+          </w:p>
+        </w:tc>
+        <w:tc>
+          <w:tcPr/>
+          <w:p>
+            <w:pPr>
+              <w:pStyle w:val="Compact"/>
+              <w:jc w:val="left"/>
+            </w:pPr>
+            <w:r>
+              <w:t xml:space="preserve">Collaudo sullo stage: schede KOS e AA, pagine provincia, confronto prima/dopo</w:t>
+            </w:r>
+          </w:p>
+        </w:tc>
+      </w:tr>
+      <w:tr>
+        <w:tc>
+          <w:tcPr/>
+          <w:p>
+            <w:pPr>
+              <w:pStyle w:val="Compact"/>
+              <w:jc w:val="left"/>
+            </w:pPr>
+            <w:r>
+              <w:t xml:space="preserve">14:00-16:00</w:t>
+            </w:r>
+          </w:p>
+        </w:tc>
+        <w:tc>
+          <w:tcPr/>
+          <w:p>
+            <w:pPr>
+              <w:pStyle w:val="Compact"/>
+              <w:jc w:val="left"/>
+            </w:pPr>
+            <w:r>
               <w:t xml:space="preserve">C</w:t>
             </w:r>
           </w:p>
@@ -3291,21 +3136,21 @@
               <w:jc w:val="left"/>
             </w:pPr>
             <w:r>
-              <w:t xml:space="preserve">Nota di consegna dello sprint 2 (impaginata) e stato dello sprint 3</w:t>
-            </w:r>
-          </w:p>
-        </w:tc>
-      </w:tr>
-      <w:tr>
-        <w:tc>
-          <w:tcPr/>
-          <w:p>
-            <w:pPr>
-              <w:pStyle w:val="Compact"/>
-              <w:jc w:val="left"/>
-            </w:pPr>
-            <w:r>
-              <w:t xml:space="preserve">16:00-18:00</w:t>
+              <w:t xml:space="preserve">Pacchetto KOS 21-23 (testi validati) e marchio « | KOS» sullo stage</w:t>
+            </w:r>
+          </w:p>
+        </w:tc>
+      </w:tr>
+      <w:tr>
+        <w:tc>
+          <w:tcPr/>
+          <w:p>
+            <w:pPr>
+              <w:pStyle w:val="Compact"/>
+              <w:jc w:val="left"/>
+            </w:pPr>
+            <w:r>
+              <w:t xml:space="preserve">16:00-17:30</w:t>
             </w:r>
           </w:p>
         </w:tc>
@@ -3329,21 +3174,58 @@
               <w:jc w:val="left"/>
             </w:pPr>
             <w:r>
-              <w:t xml:space="preserve">Margine per imprevisti; revisione della nota</w:t>
+              <w:t xml:space="preserve">Rilascio in produzione: import TV, KOS 24, KOS 21-23</w:t>
+            </w:r>
+          </w:p>
+        </w:tc>
+      </w:tr>
+      <w:tr>
+        <w:tc>
+          <w:tcPr/>
+          <w:p>
+            <w:pPr>
+              <w:pStyle w:val="Compact"/>
+              <w:jc w:val="left"/>
+            </w:pPr>
+            <w:r>
+              <w:t xml:space="preserve">17:30-18:30</w:t>
+            </w:r>
+          </w:p>
+        </w:tc>
+        <w:tc>
+          <w:tcPr/>
+          <w:p>
+            <w:pPr>
+              <w:pStyle w:val="Compact"/>
+              <w:jc w:val="left"/>
+            </w:pPr>
+            <w:r>
+              <w:t xml:space="preserve">C</w:t>
+            </w:r>
+          </w:p>
+        </w:tc>
+        <w:tc>
+          <w:tcPr/>
+          <w:p>
+            <w:pPr>
+              <w:pStyle w:val="Compact"/>
+              <w:jc w:val="left"/>
+            </w:pPr>
+            <w:r>
+              <w:t xml:space="preserve">Controllo in produzione dei rilasci del giorno (cache rigenerata, un solo JSON-LD, schede)</w:t>
             </w:r>
           </w:p>
         </w:tc>
       </w:tr>
     </w:tbl>
     <w:bookmarkEnd w:id="28"/>
-    <w:bookmarkEnd w:id="29"/>
-    <w:bookmarkStart w:id="30" w:name="cosa-può-slittare-e-come-si-recupera"/>
+    <w:bookmarkStart w:id="29" w:name="Xe7e79408a4ed13ae5ad4c712997a64652aebe43"/>
     <w:p>
       <w:pPr>
-        <w:pStyle w:val="Heading2"/>
-      </w:pPr>
-      <w:r>
-        <w:t xml:space="preserve">Cosa può slittare e come si recupera</w:t>
+        <w:pStyle w:val="Heading3"/>
+      </w:pPr>
+      <w:r>
+        <w:t xml:space="preserve">Venerdì 6/11 — ultimi rilasci, verifica, consegna pronta</w:t>
       </w:r>
     </w:p>
     <w:tbl>
@@ -3370,6 +3252,271 @@
               <w:jc w:val="left"/>
             </w:pPr>
             <w:r>
+              <w:t xml:space="preserve">Quando</w:t>
+            </w:r>
+          </w:p>
+        </w:tc>
+        <w:tc>
+          <w:tcPr/>
+          <w:p>
+            <w:pPr>
+              <w:pStyle w:val="Compact"/>
+              <w:jc w:val="left"/>
+            </w:pPr>
+            <w:r>
+              <w:t xml:space="preserve">Chi</w:t>
+            </w:r>
+          </w:p>
+        </w:tc>
+        <w:tc>
+          <w:tcPr/>
+          <w:p>
+            <w:pPr>
+              <w:pStyle w:val="Compact"/>
+              <w:jc w:val="left"/>
+            </w:pPr>
+            <w:r>
+              <w:t xml:space="preserve">Attività</w:t>
+            </w:r>
+          </w:p>
+        </w:tc>
+      </w:tr>
+      <w:tr>
+        <w:tc>
+          <w:tcPr/>
+          <w:p>
+            <w:pPr>
+              <w:pStyle w:val="Compact"/>
+              <w:jc w:val="left"/>
+            </w:pPr>
+            <w:r>
+              <w:t xml:space="preserve">9:00-11:00</w:t>
+            </w:r>
+          </w:p>
+        </w:tc>
+        <w:tc>
+          <w:tcPr/>
+          <w:p>
+            <w:pPr>
+              <w:pStyle w:val="Compact"/>
+              <w:jc w:val="left"/>
+            </w:pPr>
+            <w:r>
+              <w:t xml:space="preserve">D</w:t>
+            </w:r>
+          </w:p>
+        </w:tc>
+        <w:tc>
+          <w:tcPr/>
+          <w:p>
+            <w:pPr>
+              <w:pStyle w:val="Compact"/>
+              <w:jc w:val="left"/>
+            </w:pPr>
+            <w:r>
+              <w:t xml:space="preserve">Rilascio in produzione: AA schede (2, 5, 11, 21) e pagine provincia (AA 10), se il collaudo di giovedì è passato</w:t>
+            </w:r>
+          </w:p>
+        </w:tc>
+      </w:tr>
+      <w:tr>
+        <w:tc>
+          <w:tcPr/>
+          <w:p>
+            <w:pPr>
+              <w:pStyle w:val="Compact"/>
+              <w:jc w:val="left"/>
+            </w:pPr>
+            <w:r>
+              <w:t xml:space="preserve">11:00-13:00</w:t>
+            </w:r>
+          </w:p>
+        </w:tc>
+        <w:tc>
+          <w:tcPr/>
+          <w:p>
+            <w:pPr>
+              <w:pStyle w:val="Compact"/>
+              <w:jc w:val="left"/>
+            </w:pPr>
+            <w:r>
+              <w:t xml:space="preserve">C+D</w:t>
+            </w:r>
+          </w:p>
+        </w:tc>
+        <w:tc>
+          <w:tcPr/>
+          <w:p>
+            <w:pPr>
+              <w:pStyle w:val="Compact"/>
+              <w:jc w:val="left"/>
+            </w:pPr>
+            <w:r>
+              <w:t xml:space="preserve">Correzioni dell'ultimo minuto;</w:t>
+            </w:r>
+            <w:r>
+              <w:t xml:space="preserve"> </w:t>
+            </w:r>
+            <w:r>
+              <w:rPr>
+                <w:bCs/>
+                <w:b/>
+              </w:rPr>
+              <w:t xml:space="preserve">13:00 ultimo rilascio</w:t>
+            </w:r>
+          </w:p>
+        </w:tc>
+      </w:tr>
+      <w:tr>
+        <w:tc>
+          <w:tcPr/>
+          <w:p>
+            <w:pPr>
+              <w:pStyle w:val="Compact"/>
+              <w:jc w:val="left"/>
+            </w:pPr>
+            <w:r>
+              <w:t xml:space="preserve">13:00-14:00</w:t>
+            </w:r>
+          </w:p>
+        </w:tc>
+        <w:tc>
+          <w:tcPr/>
+          <w:p>
+            <w:pPr>
+              <w:pStyle w:val="Compact"/>
+              <w:jc w:val="left"/>
+            </w:pPr>
+            <w:r>
+              <w:t xml:space="preserve">D</w:t>
+            </w:r>
+          </w:p>
+        </w:tc>
+        <w:tc>
+          <w:tcPr/>
+          <w:p>
+            <w:pPr>
+              <w:pStyle w:val="Compact"/>
+              <w:jc w:val="left"/>
+            </w:pPr>
+            <w:r>
+              <w:t xml:space="preserve">Verifica completa in produzione (script esteso), conservata come contro-prova</w:t>
+            </w:r>
+          </w:p>
+        </w:tc>
+      </w:tr>
+      <w:tr>
+        <w:tc>
+          <w:tcPr/>
+          <w:p>
+            <w:pPr>
+              <w:pStyle w:val="Compact"/>
+              <w:jc w:val="left"/>
+            </w:pPr>
+            <w:r>
+              <w:t xml:space="preserve">14:00-16:00</w:t>
+            </w:r>
+          </w:p>
+        </w:tc>
+        <w:tc>
+          <w:tcPr/>
+          <w:p>
+            <w:pPr>
+              <w:pStyle w:val="Compact"/>
+              <w:jc w:val="left"/>
+            </w:pPr>
+            <w:r>
+              <w:t xml:space="preserve">C</w:t>
+            </w:r>
+          </w:p>
+        </w:tc>
+        <w:tc>
+          <w:tcPr/>
+          <w:p>
+            <w:pPr>
+              <w:pStyle w:val="Compact"/>
+              <w:jc w:val="left"/>
+            </w:pPr>
+            <w:r>
+              <w:t xml:space="preserve">Nota di consegna dello sprint 2 (impaginata) e stato dello sprint 3</w:t>
+            </w:r>
+          </w:p>
+        </w:tc>
+      </w:tr>
+      <w:tr>
+        <w:tc>
+          <w:tcPr/>
+          <w:p>
+            <w:pPr>
+              <w:pStyle w:val="Compact"/>
+              <w:jc w:val="left"/>
+            </w:pPr>
+            <w:r>
+              <w:t xml:space="preserve">16:00-18:00</w:t>
+            </w:r>
+          </w:p>
+        </w:tc>
+        <w:tc>
+          <w:tcPr/>
+          <w:p>
+            <w:pPr>
+              <w:pStyle w:val="Compact"/>
+              <w:jc w:val="left"/>
+            </w:pPr>
+            <w:r>
+              <w:t xml:space="preserve">D</w:t>
+            </w:r>
+          </w:p>
+        </w:tc>
+        <w:tc>
+          <w:tcPr/>
+          <w:p>
+            <w:pPr>
+              <w:pStyle w:val="Compact"/>
+              <w:jc w:val="left"/>
+            </w:pPr>
+            <w:r>
+              <w:t xml:space="preserve">Margine per imprevisti; revisione della nota</w:t>
+            </w:r>
+          </w:p>
+        </w:tc>
+      </w:tr>
+    </w:tbl>
+    <w:bookmarkEnd w:id="29"/>
+    <w:bookmarkEnd w:id="30"/>
+    <w:bookmarkStart w:id="31" w:name="cosa-può-slittare-e-come-si-recupera"/>
+    <w:p>
+      <w:pPr>
+        <w:pStyle w:val="Heading2"/>
+      </w:pPr>
+      <w:r>
+        <w:t xml:space="preserve">Cosa può slittare e come si recupera</w:t>
+      </w:r>
+    </w:p>
+    <w:tbl>
+      <w:tblPr>
+        <w:tblStyle w:val="Table"/>
+        <w:tblW w:type="auto" w:w="0"/>
+        <w:tblLook w:firstRow="1" w:lastRow="0" w:firstColumn="0" w:lastColumn="0" w:noHBand="0" w:noVBand="0" w:val="0020"/>
+        <w:jc w:val="start"/>
+      </w:tblPr>
+      <w:tblGrid>
+        <w:gridCol w:w="2640"/>
+        <w:gridCol w:w="2640"/>
+        <w:gridCol w:w="2640"/>
+      </w:tblGrid>
+      <w:tr>
+        <w:trPr>
+          <w:tblHeader w:val="true"/>
+        </w:trPr>
+        <w:tc>
+          <w:tcPr/>
+          <w:p>
+            <w:pPr>
+              <w:pStyle w:val="Compact"/>
+              <w:jc w:val="left"/>
+            </w:pPr>
+            <w:r>
               <w:t xml:space="preserve">Rischio</w:t>
             </w:r>
           </w:p>
@@ -3408,6 +3555,44 @@
               <w:jc w:val="left"/>
             </w:pPr>
             <w:r>
+              <w:t xml:space="preserve">Le due persone di KOS non disponibili martedì</w:t>
+            </w:r>
+          </w:p>
+        </w:tc>
+        <w:tc>
+          <w:tcPr/>
+          <w:p>
+            <w:pPr>
+              <w:pStyle w:val="Compact"/>
+              <w:jc w:val="left"/>
+            </w:pPr>
+            <w:r>
+              <w:t xml:space="preserve">Correzioni Yext più tardi</w:t>
+            </w:r>
+          </w:p>
+        </w:tc>
+        <w:tc>
+          <w:tcPr/>
+          <w:p>
+            <w:pPr>
+              <w:pStyle w:val="Compact"/>
+              <w:jc w:val="left"/>
+            </w:pPr>
+            <w:r>
+              <w:t xml:space="preserve">Primo orario utile entro mercoledì mattina; nell'attesa il foglio con le risposte predefinite e la scadenza: senza risposta si applica il predefinito</w:t>
+            </w:r>
+          </w:p>
+        </w:tc>
+      </w:tr>
+      <w:tr>
+        <w:tc>
+          <w:tcPr/>
+          <w:p>
+            <w:pPr>
+              <w:pStyle w:val="Compact"/>
+              <w:jc w:val="left"/>
+            </w:pPr>
+            <w:r>
               <w:t xml:space="preserve">Correzioni Yext non chiuse mercoledì</w:t>
             </w:r>
           </w:p>
@@ -3522,7 +3707,7 @@
               <w:jc w:val="left"/>
             </w:pPr>
             <w:r>
-              <w:t xml:space="preserve">Kickoff RetailTune con richieste nuove</w:t>
+              <w:t xml:space="preserve">Partenza RetailTune con richieste nuove</w:t>
             </w:r>
           </w:p>
         </w:tc>
@@ -3590,8 +3775,8 @@
         </w:tc>
       </w:tr>
     </w:tbl>
-    <w:bookmarkEnd w:id="30"/>
-    <w:bookmarkStart w:id="31" w:name="fuori-da-questa-settimana"/>
+    <w:bookmarkEnd w:id="31"/>
+    <w:bookmarkStart w:id="32" w:name="fuori-da-questa-settimana"/>
     <w:p>
       <w:pPr>
         <w:pStyle w:val="Heading2"/>
@@ -3645,8 +3830,8 @@
         <w:t xml:space="preserve">Elenco degli errori attivi delle schede per KOS: dopo le verifiche di Danilo, con la call di martedì.</w:t>
       </w:r>
     </w:p>
-    <w:bookmarkEnd w:id="31"/>
     <w:bookmarkEnd w:id="32"/>
+    <w:bookmarkEnd w:id="33"/>
     <w:sectPr/>
   </w:body>
 </w:document>

</xml_diff>

<commit_message>
Piano della settimana: stato dei PDF verificato, bozze del 31/10
Co-Authored-By: Claude Opus 5.5 <noreply@anthropic.com>
Claude-Session: https://claude.ai/code/session_01Rr1X44gsg7BUwMzrRvYrc2
</commit_message>
<xml_diff>
--- a/docs/docx/piano-settimana-2-6-novembre.docx
+++ b/docs/docx/piano-settimana-2-6-novembre.docx
@@ -2,7 +2,7 @@
 <file path=word/document.xml><?xml version="1.0" encoding="utf-8"?>
 <w:document xmlns:w="http://schemas.openxmlformats.org/wordprocessingml/2006/main" xmlns:m="http://schemas.openxmlformats.org/officeDocument/2006/math" xmlns:r="http://schemas.openxmlformats.org/officeDocument/2006/relationships" xmlns:o="urn:schemas-microsoft-com:office:office" xmlns:v="urn:schemas-microsoft-com:vml" xmlns:w10="urn:schemas-microsoft-com:office:word" xmlns:a="http://schemas.openxmlformats.org/drawingml/2006/main" xmlns:pic="http://schemas.openxmlformats.org/drawingml/2006/picture" xmlns:wp="http://schemas.openxmlformats.org/drawingml/2006/wordprocessingDrawing">
   <w:body>
-    <w:bookmarkStart w:id="33" w:name="X4d9970faf1cc5a08ce749cd59924c4c819b2c33"/>
+    <w:bookmarkStart w:id="34" w:name="X4d9970faf1cc5a08ce749cd59924c4c819b2c33"/>
     <w:p>
       <w:pPr>
         <w:pStyle w:val="Heading1"/>
@@ -536,7 +536,34 @@
               <w:jc w:val="left"/>
             </w:pPr>
             <w:r>
-              <w:t xml:space="preserve">Classificazione, titoli, esclusione dall'indice: stato da controllare lunedì</w:t>
+              <w:t xml:space="preserve">Verificato il 31/10: classificazione, titoli ed esclusione dall'indice non ancora fatti (nessuna regola</w:t>
+            </w:r>
+            <w:r>
+              <w:t xml:space="preserve"> </w:t>
+            </w:r>
+            <w:r>
+              <w:rPr>
+                <w:rStyle w:val="VerbatimChar"/>
+              </w:rPr>
+              <w:t xml:space="preserve">X-Robots-Tag</w:t>
+            </w:r>
+            <w:r>
+              <w:t xml:space="preserve">). Classificazione da chiedere a KOS nella call; poi</w:t>
+            </w:r>
+            <w:r>
+              <w:t xml:space="preserve"> </w:t>
+            </w:r>
+            <w:r>
+              <w:rPr>
+                <w:rStyle w:val="VerbatimChar"/>
+              </w:rPr>
+              <w:t xml:space="preserve">noindex, nofollow</w:t>
+            </w:r>
+            <w:r>
+              <w:t xml:space="preserve"> </w:t>
+            </w:r>
+            <w:r>
+              <w:t xml:space="preserve">via regole web, sitemap dei PDF per seguire la deindicizzazione</w:t>
             </w:r>
           </w:p>
         </w:tc>
@@ -726,7 +753,22 @@
               <w:jc w:val="left"/>
             </w:pPr>
             <w:r>
-              <w:t xml:space="preserve">Classificazione, titoli, esclusione dall'indice: stato da controllare lunedì</w:t>
+              <w:t xml:space="preserve">Come KOS 8 (verificato il 31/10). L'audit AA chiede</w:t>
+            </w:r>
+            <w:r>
+              <w:t xml:space="preserve"> </w:t>
+            </w:r>
+            <w:r>
+              <w:rPr>
+                <w:rStyle w:val="VerbatimChar"/>
+              </w:rPr>
+              <w:t xml:space="preserve">noindex, nofollow</w:t>
+            </w:r>
+            <w:r>
+              <w:t xml:space="preserve"> </w:t>
+            </w:r>
+            <w:r>
+              <w:t xml:space="preserve">su tutti i PDF</w:t>
             </w:r>
           </w:p>
         </w:tc>
@@ -1381,7 +1423,68 @@
       </w:r>
     </w:p>
     <w:bookmarkEnd w:id="23"/>
-    <w:bookmarkStart w:id="30" w:name="programma"/>
+    <w:bookmarkStart w:id="24" w:name="fatto-il-3110"/>
+    <w:p>
+      <w:pPr>
+        <w:pStyle w:val="Heading2"/>
+      </w:pPr>
+      <w:r>
+        <w:t xml:space="preserve">Fatto il 31/10</w:t>
+      </w:r>
+    </w:p>
+    <w:p>
+      <w:pPr>
+        <w:numPr>
+          <w:ilvl w:val="0"/>
+          <w:numId w:val="1003"/>
+        </w:numPr>
+        <w:pStyle w:val="Compact"/>
+      </w:pPr>
+      <w:r>
+        <w:t xml:space="preserve">Bozza del primo invio a RetailTune:</w:t>
+      </w:r>
+      <w:r>
+        <w:t xml:space="preserve"> </w:t>
+      </w:r>
+      <w:r>
+        <w:rPr>
+          <w:rStyle w:val="VerbatimChar"/>
+        </w:rPr>
+        <w:t xml:space="preserve">docs/retailtune/invio-1-configurazione.md</w:t>
+      </w:r>
+      <w:r>
+        <w:t xml:space="preserve"> </w:t>
+      </w:r>
+      <w:r>
+        <w:t xml:space="preserve">(decisioni di Danilo segnate [Da decidere]).</w:t>
+      </w:r>
+    </w:p>
+    <w:p>
+      <w:pPr>
+        <w:numPr>
+          <w:ilvl w:val="0"/>
+          <w:numId w:val="1003"/>
+        </w:numPr>
+        <w:pStyle w:val="Compact"/>
+      </w:pPr>
+      <w:r>
+        <w:t xml:space="preserve">Bozza per KOS e agenzia sulle schede Google (fasi, nomi, siti e UTM, categorie per gruppo, verificate nel selettore il 31/10):</w:t>
+      </w:r>
+      <w:r>
+        <w:t xml:space="preserve"> </w:t>
+      </w:r>
+      <w:r>
+        <w:rPr>
+          <w:rStyle w:val="VerbatimChar"/>
+        </w:rPr>
+        <w:t xml:space="preserve">docs/schede-google-passaggio-retailtune.md</w:t>
+      </w:r>
+      <w:r>
+        <w:t xml:space="preserve">. A KOS lunedì 9:00 (osservazioni entro le 15), all'agenzia lunedì sera o martedì mattina; le categorie escono dalla mail di martedì, che resta con i testi KOS 21-23 e i 6 title AA.</w:t>
+      </w:r>
+    </w:p>
+    <w:bookmarkEnd w:id="24"/>
+    <w:bookmarkStart w:id="31" w:name="programma"/>
     <w:p>
       <w:pPr>
         <w:pStyle w:val="Heading2"/>
@@ -1430,7 +1533,7 @@
         <w:t xml:space="preserve">= Claude. Le stime di Danilo sono in ore effettive.</w:t>
       </w:r>
     </w:p>
-    <w:bookmarkStart w:id="24" w:name="X6c88cb8ab8bb842e40fe2ba9c248a69273f69d8"/>
+    <w:bookmarkStart w:id="25" w:name="X6c88cb8ab8bb842e40fe2ba9c248a69273f69d8"/>
     <w:p>
       <w:pPr>
         <w:pStyle w:val="Heading3"/>
@@ -1653,8 +1756,8 @@
         </w:tc>
       </w:tr>
     </w:tbl>
-    <w:bookmarkEnd w:id="24"/>
-    <w:bookmarkStart w:id="25" w:name="X24f00ea4a91daa355d7933937e8c7ffd1eeb76f"/>
+    <w:bookmarkEnd w:id="25"/>
+    <w:bookmarkStart w:id="26" w:name="X24f00ea4a91daa355d7933937e8c7ffd1eeb76f"/>
     <w:p>
       <w:pPr>
         <w:pStyle w:val="Heading3"/>
@@ -2058,8 +2161,8 @@
         </w:tc>
       </w:tr>
     </w:tbl>
-    <w:bookmarkEnd w:id="25"/>
-    <w:bookmarkStart w:id="26" w:name="martedì-311--call-kos-invio-allagenzia"/>
+    <w:bookmarkEnd w:id="26"/>
+    <w:bookmarkStart w:id="27" w:name="martedì-311--call-kos-invio-allagenzia"/>
     <w:p>
       <w:pPr>
         <w:pStyle w:val="Heading3"/>
@@ -2446,8 +2549,8 @@
         </w:tc>
       </w:tr>
     </w:tbl>
-    <w:bookmarkEnd w:id="26"/>
-    <w:bookmarkStart w:id="27" w:name="X8f1dfa7040175622d26fd4fcebc4b5f9a36bb23"/>
+    <w:bookmarkEnd w:id="27"/>
+    <w:bookmarkStart w:id="28" w:name="X8f1dfa7040175622d26fd4fcebc4b5f9a36bb23"/>
     <w:p>
       <w:pPr>
         <w:pStyle w:val="Heading3"/>
@@ -2876,8 +2979,8 @@
         </w:tc>
       </w:tr>
     </w:tbl>
-    <w:bookmarkEnd w:id="27"/>
-    <w:bookmarkStart w:id="28" w:name="X7de954f4b07d14870ac9711b8036516c1e393f1"/>
+    <w:bookmarkEnd w:id="28"/>
+    <w:bookmarkStart w:id="29" w:name="X7de954f4b07d14870ac9711b8036516c1e393f1"/>
     <w:p>
       <w:pPr>
         <w:pStyle w:val="Heading3"/>
@@ -3218,8 +3321,8 @@
         </w:tc>
       </w:tr>
     </w:tbl>
-    <w:bookmarkEnd w:id="28"/>
-    <w:bookmarkStart w:id="29" w:name="Xe7e79408a4ed13ae5ad4c712997a64652aebe43"/>
+    <w:bookmarkEnd w:id="29"/>
+    <w:bookmarkStart w:id="30" w:name="Xe7e79408a4ed13ae5ad4c712997a64652aebe43"/>
     <w:p>
       <w:pPr>
         <w:pStyle w:val="Heading3"/>
@@ -3482,9 +3585,9 @@
         </w:tc>
       </w:tr>
     </w:tbl>
-    <w:bookmarkEnd w:id="29"/>
     <w:bookmarkEnd w:id="30"/>
-    <w:bookmarkStart w:id="31" w:name="cosa-può-slittare-e-come-si-recupera"/>
+    <w:bookmarkEnd w:id="31"/>
+    <w:bookmarkStart w:id="32" w:name="cosa-può-slittare-e-come-si-recupera"/>
     <w:p>
       <w:pPr>
         <w:pStyle w:val="Heading2"/>
@@ -3775,8 +3878,8 @@
         </w:tc>
       </w:tr>
     </w:tbl>
-    <w:bookmarkEnd w:id="31"/>
-    <w:bookmarkStart w:id="32" w:name="fuori-da-questa-settimana"/>
+    <w:bookmarkEnd w:id="32"/>
+    <w:bookmarkStart w:id="33" w:name="fuori-da-questa-settimana"/>
     <w:p>
       <w:pPr>
         <w:pStyle w:val="Heading2"/>
@@ -3789,7 +3892,7 @@
       <w:pPr>
         <w:numPr>
           <w:ilvl w:val="0"/>
-          <w:numId w:val="1003"/>
+          <w:numId w:val="1004"/>
         </w:numPr>
         <w:pStyle w:val="Compact"/>
       </w:pPr>
@@ -3801,7 +3904,7 @@
       <w:pPr>
         <w:numPr>
           <w:ilvl w:val="0"/>
-          <w:numId w:val="1003"/>
+          <w:numId w:val="1004"/>
         </w:numPr>
         <w:pStyle w:val="Compact"/>
       </w:pPr>
@@ -3822,7 +3925,7 @@
       <w:pPr>
         <w:numPr>
           <w:ilvl w:val="0"/>
-          <w:numId w:val="1003"/>
+          <w:numId w:val="1004"/>
         </w:numPr>
         <w:pStyle w:val="Compact"/>
       </w:pPr>
@@ -3830,8 +3933,8 @@
         <w:t xml:space="preserve">Elenco degli errori attivi delle schede per KOS: dopo le verifiche di Danilo, con la call di martedì.</w:t>
       </w:r>
     </w:p>
-    <w:bookmarkEnd w:id="32"/>
     <w:bookmarkEnd w:id="33"/>
+    <w:bookmarkEnd w:id="34"/>
     <w:sectPr/>
   </w:body>
 </w:document>
@@ -4136,6 +4239,9 @@
     </w:lvlOverride>
   </w:num>
   <w:num w:numId="1003">
+    <w:abstractNumId w:val="991"/>
+  </w:num>
+  <w:num w:numId="1004">
     <w:abstractNumId w:val="991"/>
   </w:num>
 </w:numbering>

</xml_diff>

<commit_message>
Pagine provincia AA vuote non pubblicate in produzione (31/10), controllo a valle
Co-Authored-By: Claude Opus 5.5 <noreply@anthropic.com>
Claude-Session: https://claude.ai/code/session_01Rr1X44gsg7BUwMzrRvYrc2
</commit_message>
<xml_diff>
--- a/docs/docx/piano-settimana-2-6-novembre.docx
+++ b/docs/docx/piano-settimana-2-6-novembre.docx
@@ -1528,7 +1528,110 @@
         <w:t xml:space="preserve"> </w:t>
       </w:r>
       <w:r>
-        <w:t xml:space="preserve">contenuto. Poi: pagine vere con template provincia, testo, elenco strutturato (stessa forma di AA-10) e widget RetailTune</w:t>
+        <w:t xml:space="preserve">contenuto:</w:t>
+      </w:r>
+      <w:r>
+        <w:t xml:space="preserve"> </w:t>
+      </w:r>
+      <w:r>
+        <w:rPr>
+          <w:bCs/>
+          <w:b/>
+        </w:rPr>
+        <w:t xml:space="preserve">fatto il 31/10</w:t>
+      </w:r>
+      <w:r>
+        <w:t xml:space="preserve"> </w:t>
+      </w:r>
+      <w:r>
+        <w:t xml:space="preserve">con</w:t>
+      </w:r>
+      <w:r>
+        <w:t xml:space="preserve"> </w:t>
+      </w:r>
+      <w:r>
+        <w:rPr>
+          <w:rStyle w:val="VerbatimChar"/>
+        </w:rPr>
+        <w:t xml:space="preserve">aggiorna-campi.php</w:t>
+      </w:r>
+      <w:r>
+        <w:t xml:space="preserve"> </w:t>
+      </w:r>
+      <w:r>
+        <w:t xml:space="preserve">(campo</w:t>
+      </w:r>
+      <w:r>
+        <w:t xml:space="preserve"> </w:t>
+      </w:r>
+      <w:r>
+        <w:rPr>
+          <w:rStyle w:val="VerbatimChar"/>
+        </w:rPr>
+        <w:t xml:space="preserve">published</w:t>
+      </w:r>
+      <w:r>
+        <w:t xml:space="preserve">), stage e produzione; produzione: backup</w:t>
+      </w:r>
+      <w:r>
+        <w:t xml:space="preserve"> </w:t>
+      </w:r>
+      <w:r>
+        <w:rPr>
+          <w:rStyle w:val="VerbatimChar"/>
+        </w:rPr>
+        <w:t xml:space="preserve">/paas/c0072/backup-kos-seo-geo/20261031-035209-campi</w:t>
+      </w:r>
+      <w:r>
+        <w:t xml:space="preserve"> </w:t>
+      </w:r>
+      <w:r>
+        <w:t xml:space="preserve">(ripristino</w:t>
+      </w:r>
+      <w:r>
+        <w:t xml:space="preserve"> </w:t>
+      </w:r>
+      <w:r>
+        <w:rPr>
+          <w:rStyle w:val="VerbatimChar"/>
+        </w:rPr>
+        <w:t xml:space="preserve">aggiorna-campi.php /www --ripristina &lt;cartella&gt; --scrivi</w:t>
+      </w:r>
+      <w:r>
+        <w:t xml:space="preserve">).</w:t>
+      </w:r>
+      <w:r>
+        <w:t xml:space="preserve"> </w:t>
+      </w:r>
+      <w:r>
+        <w:t xml:space="preserve">Controllo: 11 pagine in 404, 450 pagine della sitemap in 200 con un solo JSON-LD, nessun link verso le 11 da home, regioni,</w:t>
+      </w:r>
+      <w:r>
+        <w:t xml:space="preserve"> </w:t>
+      </w:r>
+      <w:r>
+        <w:rPr>
+          <w:rStyle w:val="VerbatimChar"/>
+        </w:rPr>
+        <w:t xml:space="preserve">/residenze</w:t>
+      </w:r>
+      <w:r>
+        <w:t xml:space="preserve"> </w:t>
+      </w:r>
+      <w:r>
+        <w:t xml:space="preserve">e</w:t>
+      </w:r>
+      <w:r>
+        <w:t xml:space="preserve"> </w:t>
+      </w:r>
+      <w:r>
+        <w:rPr>
+          <w:rStyle w:val="VerbatimChar"/>
+        </w:rPr>
+        <w:t xml:space="preserve">llms.txt</w:t>
+      </w:r>
+      <w:r>
+        <w:t xml:space="preserve">. Poi: pagine vere con template provincia, testo, elenco strutturato (stessa forma di AA-10) e widget RetailTune</w:t>
       </w:r>
       <w:r>
         <w:t xml:space="preserve"> </w:t>

</xml_diff>

<commit_message>
Piano: allineamento con gli interventi della chat sulle prestazioni (19-31/10); regola sui tag nei commenti HTML
Co-Authored-By: Claude Opus 5.5 <noreply@anthropic.com>
Claude-Session: https://claude.ai/code/session_01Rr1X44gsg7BUwMzrRvYrc2
</commit_message>
<xml_diff>
--- a/docs/docx/piano-settimana-2-6-novembre.docx
+++ b/docs/docx/piano-settimana-2-6-novembre.docx
@@ -2,7 +2,7 @@
 <file path=word/document.xml><?xml version="1.0" encoding="utf-8"?>
 <w:document xmlns:w="http://schemas.openxmlformats.org/wordprocessingml/2006/main" xmlns:m="http://schemas.openxmlformats.org/officeDocument/2006/math" xmlns:r="http://schemas.openxmlformats.org/officeDocument/2006/relationships" xmlns:o="urn:schemas-microsoft-com:office:office" xmlns:v="urn:schemas-microsoft-com:vml" xmlns:w10="urn:schemas-microsoft-com:office:word" xmlns:a="http://schemas.openxmlformats.org/drawingml/2006/main" xmlns:pic="http://schemas.openxmlformats.org/drawingml/2006/picture" xmlns:wp="http://schemas.openxmlformats.org/drawingml/2006/wordprocessingDrawing">
   <w:body>
-    <w:bookmarkStart w:id="35" w:name="X4d9970faf1cc5a08ce749cd59924c4c819b2c33"/>
+    <w:bookmarkStart w:id="36" w:name="X4d9970faf1cc5a08ce749cd59924c4c819b2c33"/>
     <w:p>
       <w:pPr>
         <w:pStyle w:val="Heading1"/>
@@ -1647,7 +1647,869 @@
       </w:r>
     </w:p>
     <w:bookmarkEnd w:id="25"/>
-    <w:bookmarkStart w:id="32" w:name="programma"/>
+    <w:bookmarkStart w:id="26" w:name="X803968b52fba7dcff5efb48d5f3bda5e3130220"/>
+    <w:p>
+      <w:pPr>
+        <w:pStyle w:val="Heading2"/>
+      </w:pPr>
+      <w:r>
+        <w:t xml:space="preserve">Allineamento con la chat sulle prestazioni (istruzioni del 31/10)</w:t>
+      </w:r>
+    </w:p>
+    <w:p>
+      <w:pPr>
+        <w:pStyle w:val="FirstParagraph"/>
+      </w:pPr>
+      <w:r>
+        <w:t xml:space="preserve">Fonte:</w:t>
+      </w:r>
+      <w:r>
+        <w:t xml:space="preserve"> </w:t>
+      </w:r>
+      <w:r>
+        <w:rPr>
+          <w:rStyle w:val="VerbatimChar"/>
+        </w:rPr>
+        <w:t xml:space="preserve">ISTRUZIONI-ALTRA-CHAT.md</w:t>
+      </w:r>
+      <w:r>
+        <w:t xml:space="preserve"> </w:t>
+      </w:r>
+      <w:r>
+        <w:t xml:space="preserve">e</w:t>
+      </w:r>
+      <w:r>
+        <w:t xml:space="preserve"> </w:t>
+      </w:r>
+      <w:r>
+        <w:rPr>
+          <w:rStyle w:val="VerbatimChar"/>
+        </w:rPr>
+        <w:t xml:space="preserve">handoff-ttfb-kosgroup-anniazzurri.md</w:t>
+      </w:r>
+      <w:r>
+        <w:t xml:space="preserve"> </w:t>
+      </w:r>
+      <w:r>
+        <w:t xml:space="preserve">nella cartella</w:t>
+      </w:r>
+      <w:r>
+        <w:t xml:space="preserve"> </w:t>
+      </w:r>
+      <w:r>
+        <w:rPr>
+          <w:rStyle w:val="VerbatimChar"/>
+        </w:rPr>
+        <w:t xml:space="preserve">monitor</w:t>
+      </w:r>
+      <w:r>
+        <w:t xml:space="preserve"> </w:t>
+      </w:r>
+      <w:r>
+        <w:t xml:space="preserve">di Danilo. Dal 19 al</w:t>
+      </w:r>
+      <w:r>
+        <w:t xml:space="preserve"> </w:t>
+      </w:r>
+      <w:r>
+        <w:t xml:space="preserve">31/10 l'altra chat ha modificato in produzione elementi, impostazioni e regole web dei due siti. Finché il repository non</w:t>
+      </w:r>
+      <w:r>
+        <w:t xml:space="preserve"> </w:t>
+      </w:r>
+      <w:r>
+        <w:t xml:space="preserve">li contiene, un nostro rilascio li sovrascriverebbe (o, con la baseline vecchia,</w:t>
+      </w:r>
+      <w:r>
+        <w:t xml:space="preserve"> </w:t>
+      </w:r>
+      <w:r>
+        <w:rPr>
+          <w:rStyle w:val="VerbatimChar"/>
+        </w:rPr>
+        <w:t xml:space="preserve">installa-elementi.php</w:t>
+      </w:r>
+      <w:r>
+        <w:t xml:space="preserve"> </w:t>
+      </w:r>
+      <w:r>
+        <w:t xml:space="preserve">si fermerebbe).</w:t>
+      </w:r>
+    </w:p>
+    <w:tbl>
+      <w:tblPr>
+        <w:tblStyle w:val="Table"/>
+        <w:tblW w:type="auto" w:w="0"/>
+        <w:tblLook w:firstRow="1" w:lastRow="0" w:firstColumn="0" w:lastColumn="0" w:noHBand="0" w:noVBand="0" w:val="0020"/>
+        <w:jc w:val="start"/>
+      </w:tblPr>
+      <w:tblGrid>
+        <w:gridCol w:w="1980"/>
+        <w:gridCol w:w="1980"/>
+        <w:gridCol w:w="1980"/>
+        <w:gridCol w:w="1980"/>
+      </w:tblGrid>
+      <w:tr>
+        <w:trPr>
+          <w:tblHeader w:val="true"/>
+        </w:trPr>
+        <w:tc>
+          <w:tcPr/>
+          <w:p>
+            <w:pPr>
+              <w:pStyle w:val="Compact"/>
+              <w:jc w:val="left"/>
+            </w:pPr>
+            <w:r>
+              <w:t xml:space="preserve">Passo</w:t>
+            </w:r>
+          </w:p>
+        </w:tc>
+        <w:tc>
+          <w:tcPr/>
+          <w:p>
+            <w:pPr>
+              <w:pStyle w:val="Compact"/>
+              <w:jc w:val="left"/>
+            </w:pPr>
+            <w:r>
+              <w:t xml:space="preserve">Chi</w:t>
+            </w:r>
+          </w:p>
+        </w:tc>
+        <w:tc>
+          <w:tcPr/>
+          <w:p>
+            <w:pPr>
+              <w:pStyle w:val="Compact"/>
+              <w:jc w:val="left"/>
+            </w:pPr>
+            <w:r>
+              <w:t xml:space="preserve">Quando</w:t>
+            </w:r>
+          </w:p>
+        </w:tc>
+        <w:tc>
+          <w:tcPr/>
+          <w:p>
+            <w:pPr>
+              <w:pStyle w:val="Compact"/>
+              <w:jc w:val="left"/>
+            </w:pPr>
+            <w:r>
+              <w:t xml:space="preserve">Cosa</w:t>
+            </w:r>
+          </w:p>
+        </w:tc>
+      </w:tr>
+      <w:tr>
+        <w:tc>
+          <w:tcPr/>
+          <w:p>
+            <w:pPr>
+              <w:pStyle w:val="Compact"/>
+              <w:jc w:val="left"/>
+            </w:pPr>
+            <w:r>
+              <w:t xml:space="preserve">1</w:t>
+            </w:r>
+          </w:p>
+        </w:tc>
+        <w:tc>
+          <w:tcPr/>
+          <w:p>
+            <w:pPr>
+              <w:pStyle w:val="Compact"/>
+              <w:jc w:val="left"/>
+            </w:pPr>
+            <w:r>
+              <w:t xml:space="preserve">D</w:t>
+            </w:r>
+          </w:p>
+        </w:tc>
+        <w:tc>
+          <w:tcPr/>
+          <w:p>
+            <w:pPr>
+              <w:pStyle w:val="Compact"/>
+              <w:jc w:val="left"/>
+            </w:pPr>
+            <w:r>
+              <w:t xml:space="preserve">domenica</w:t>
+            </w:r>
+          </w:p>
+        </w:tc>
+        <w:tc>
+          <w:tcPr/>
+          <w:p>
+            <w:pPr>
+              <w:pStyle w:val="Compact"/>
+              <w:jc w:val="left"/>
+            </w:pPr>
+            <w:r>
+              <w:t xml:space="preserve">Esportazione degli elementi dalle due produzioni (</w:t>
+            </w:r>
+            <w:r>
+              <w:rPr>
+                <w:rStyle w:val="VerbatimChar"/>
+              </w:rPr>
+              <w:t xml:space="preserve">docs/guida-riallineamento-stage.md</w:t>
+            </w:r>
+            <w:r>
+              <w:t xml:space="preserve">, passo 4) e copia delle regole web KOS dal pannello; file nella cartella</w:t>
+            </w:r>
+            <w:r>
+              <w:t xml:space="preserve"> </w:t>
+            </w:r>
+            <w:r>
+              <w:rPr>
+                <w:rStyle w:val="VerbatimChar"/>
+              </w:rPr>
+              <w:t xml:space="preserve">monitor</w:t>
+            </w:r>
+          </w:p>
+        </w:tc>
+      </w:tr>
+      <w:tr>
+        <w:tc>
+          <w:tcPr/>
+          <w:p>
+            <w:pPr>
+              <w:pStyle w:val="Compact"/>
+              <w:jc w:val="left"/>
+            </w:pPr>
+            <w:r>
+              <w:t xml:space="preserve">2</w:t>
+            </w:r>
+          </w:p>
+        </w:tc>
+        <w:tc>
+          <w:tcPr/>
+          <w:p>
+            <w:pPr>
+              <w:pStyle w:val="Compact"/>
+              <w:jc w:val="left"/>
+            </w:pPr>
+            <w:r>
+              <w:t xml:space="preserve">C</w:t>
+            </w:r>
+          </w:p>
+        </w:tc>
+        <w:tc>
+          <w:tcPr/>
+          <w:p>
+            <w:pPr>
+              <w:pStyle w:val="Compact"/>
+              <w:jc w:val="left"/>
+            </w:pPr>
+            <w:r>
+              <w:t xml:space="preserve">domenica</w:t>
+            </w:r>
+          </w:p>
+        </w:tc>
+        <w:tc>
+          <w:tcPr/>
+          <w:p>
+            <w:pPr>
+              <w:pStyle w:val="Compact"/>
+              <w:jc w:val="left"/>
+            </w:pPr>
+            <w:r>
+              <w:t xml:space="preserve">Confronto con il repository: elementi del progetto cambiati in produzione (es.</w:t>
+            </w:r>
+            <w:r>
+              <w:t xml:space="preserve"> </w:t>
+            </w:r>
+            <w:r>
+              <w:rPr>
+                <w:rStyle w:val="VerbatimChar"/>
+              </w:rPr>
+              <w:t xml:space="preserve">breadcrumb</w:t>
+            </w:r>
+            <w:r>
+              <w:t xml:space="preserve">,</w:t>
+            </w:r>
+            <w:r>
+              <w:t xml:space="preserve"> </w:t>
+            </w:r>
+            <w:r>
+              <w:rPr>
+                <w:rStyle w:val="VerbatimChar"/>
+              </w:rPr>
+              <w:t xml:space="preserve">ogImage</w:t>
+            </w:r>
+            <w:r>
+              <w:t xml:space="preserve"> </w:t>
+            </w:r>
+            <w:r>
+              <w:t xml:space="preserve">KOS, head e footer AA) → modifiche integrate in</w:t>
+            </w:r>
+            <w:r>
+              <w:t xml:space="preserve"> </w:t>
+            </w:r>
+            <w:r>
+              <w:rPr>
+                <w:rStyle w:val="VerbatimChar"/>
+              </w:rPr>
+              <w:t xml:space="preserve">elements/</w:t>
+            </w:r>
+            <w:r>
+              <w:t xml:space="preserve">; tutti gli altri → nuova baseline; regole web aggiornate nel repository. Registro in</w:t>
+            </w:r>
+            <w:r>
+              <w:t xml:space="preserve"> </w:t>
+            </w:r>
+            <w:r>
+              <w:rPr>
+                <w:rStyle w:val="VerbatimChar"/>
+              </w:rPr>
+              <w:t xml:space="preserve">docs/elementi-sotto-progetto.md</w:t>
+            </w:r>
+          </w:p>
+        </w:tc>
+      </w:tr>
+      <w:tr>
+        <w:tc>
+          <w:tcPr/>
+          <w:p>
+            <w:pPr>
+              <w:pStyle w:val="Compact"/>
+              <w:jc w:val="left"/>
+            </w:pPr>
+            <w:r>
+              <w:t xml:space="preserve">3</w:t>
+            </w:r>
+          </w:p>
+        </w:tc>
+        <w:tc>
+          <w:tcPr/>
+          <w:p>
+            <w:pPr>
+              <w:pStyle w:val="Compact"/>
+              <w:jc w:val="left"/>
+            </w:pPr>
+            <w:r>
+              <w:t xml:space="preserve">C</w:t>
+            </w:r>
+          </w:p>
+        </w:tc>
+        <w:tc>
+          <w:tcPr/>
+          <w:p>
+            <w:pPr>
+              <w:pStyle w:val="Compact"/>
+              <w:jc w:val="left"/>
+            </w:pPr>
+            <w:r>
+              <w:t xml:space="preserve">domenica</w:t>
+            </w:r>
+          </w:p>
+        </w:tc>
+        <w:tc>
+          <w:tcPr/>
+          <w:p>
+            <w:pPr>
+              <w:pStyle w:val="Compact"/>
+              <w:jc w:val="left"/>
+            </w:pPr>
+            <w:r>
+              <w:t xml:space="preserve">Pacchetto</w:t>
+            </w:r>
+            <w:r>
+              <w:t xml:space="preserve"> </w:t>
+            </w:r>
+            <w:r>
+              <w:rPr>
+                <w:rStyle w:val="VerbatimChar"/>
+              </w:rPr>
+              <w:t xml:space="preserve">kos-ttfb-31-10</w:t>
+            </w:r>
+            <w:r>
+              <w:t xml:space="preserve"> </w:t>
+            </w:r>
+            <w:r>
+              <w:t xml:space="preserve">con i 5 file pronti dell'altra chat (</w:t>
+            </w:r>
+            <w:r>
+              <w:rPr>
+                <w:rStyle w:val="VerbatimChar"/>
+              </w:rPr>
+              <w:t xml:space="preserve">template informativo</w:t>
+            </w:r>
+            <w:r>
+              <w:t xml:space="preserve">,</w:t>
+            </w:r>
+            <w:r>
+              <w:t xml:space="preserve"> </w:t>
+            </w:r>
+            <w:r>
+              <w:rPr>
+                <w:rStyle w:val="VerbatimChar"/>
+              </w:rPr>
+              <w:t xml:space="preserve">listingNewsLast3</w:t>
+            </w:r>
+            <w:r>
+              <w:t xml:space="preserve">,</w:t>
+            </w:r>
+            <w:r>
+              <w:t xml:space="preserve"> </w:t>
+            </w:r>
+            <w:r>
+              <w:rPr>
+                <w:rStyle w:val="VerbatimChar"/>
+              </w:rPr>
+              <w:t xml:space="preserve">kosplayer-banner</w:t>
+            </w:r>
+            <w:r>
+              <w:t xml:space="preserve">,</w:t>
+            </w:r>
+            <w:r>
+              <w:t xml:space="preserve"> </w:t>
+            </w:r>
+            <w:r>
+              <w:rPr>
+                <w:rStyle w:val="VerbatimChar"/>
+              </w:rPr>
+              <w:t xml:space="preserve">listingComunicati</w:t>
+            </w:r>
+            <w:r>
+              <w:t xml:space="preserve">, chunk 209), più la rimozione di</w:t>
+            </w:r>
+            <w:r>
+              <w:t xml:space="preserve"> </w:t>
+            </w:r>
+            <w:r>
+              <w:rPr>
+                <w:rStyle w:val="VerbatimChar"/>
+              </w:rPr>
+              <w:t xml:space="preserve">[[*schemaJsonLd]]</w:t>
+            </w:r>
+            <w:r>
+              <w:t xml:space="preserve"> </w:t>
+            </w:r>
+            <w:r>
+              <w:t xml:space="preserve">dal template</w:t>
+            </w:r>
+            <w:r>
+              <w:t xml:space="preserve"> </w:t>
+            </w:r>
+            <w:r>
+              <w:rPr>
+                <w:rStyle w:val="VerbatimChar"/>
+              </w:rPr>
+              <w:t xml:space="preserve">informativo</w:t>
+            </w:r>
+            <w:r>
+              <w:t xml:space="preserve"> </w:t>
+            </w:r>
+            <w:r>
+              <w:t xml:space="preserve">(TV vuota su tutte le pagine dal 30/10). Pacchetto</w:t>
+            </w:r>
+            <w:r>
+              <w:t xml:space="preserve"> </w:t>
+            </w:r>
+            <w:r>
+              <w:rPr>
+                <w:rStyle w:val="VerbatimChar"/>
+              </w:rPr>
+              <w:t xml:space="preserve">aa-news</w:t>
+            </w:r>
+            <w:r>
+              <w:t xml:space="preserve"> </w:t>
+            </w:r>
+            <w:r>
+              <w:t xml:space="preserve">per</w:t>
+            </w:r>
+            <w:r>
+              <w:t xml:space="preserve"> </w:t>
+            </w:r>
+            <w:r>
+              <w:rPr>
+                <w:rStyle w:val="VerbatimChar"/>
+              </w:rPr>
+              <w:t xml:space="preserve">/news/</w:t>
+            </w:r>
+            <w:r>
+              <w:t xml:space="preserve"> </w:t>
+            </w:r>
+            <w:r>
+              <w:t xml:space="preserve">(template</w:t>
+            </w:r>
+            <w:r>
+              <w:t xml:space="preserve"> </w:t>
+            </w:r>
+            <w:r>
+              <w:rPr>
+                <w:rStyle w:val="VerbatimChar"/>
+              </w:rPr>
+              <w:t xml:space="preserve">news</w:t>
+            </w:r>
+            <w:r>
+              <w:t xml:space="preserve"> </w:t>
+            </w:r>
+            <w:r>
+              <w:t xml:space="preserve">e chunk</w:t>
+            </w:r>
+            <w:r>
+              <w:t xml:space="preserve"> </w:t>
+            </w:r>
+            <w:r>
+              <w:rPr>
+                <w:rStyle w:val="VerbatimChar"/>
+              </w:rPr>
+              <w:t xml:space="preserve">news-list</w:t>
+            </w:r>
+            <w:r>
+              <w:t xml:space="preserve"> </w:t>
+            </w:r>
+            <w:r>
+              <w:t xml:space="preserve">in cache), con la verifica di</w:t>
+            </w:r>
+            <w:r>
+              <w:t xml:space="preserve"> </w:t>
+            </w:r>
+            <w:r>
+              <w:rPr>
+                <w:rStyle w:val="VerbatimChar"/>
+              </w:rPr>
+              <w:t xml:space="preserve">newsImage</w:t>
+            </w:r>
+            <w:r>
+              <w:t xml:space="preserve"> </w:t>
+            </w:r>
+            <w:r>
+              <w:t xml:space="preserve">prima del rilascio</w:t>
+            </w:r>
+          </w:p>
+        </w:tc>
+      </w:tr>
+      <w:tr>
+        <w:tc>
+          <w:tcPr/>
+          <w:p>
+            <w:pPr>
+              <w:pStyle w:val="Compact"/>
+              <w:jc w:val="left"/>
+            </w:pPr>
+            <w:r>
+              <w:t xml:space="preserve">4</w:t>
+            </w:r>
+          </w:p>
+        </w:tc>
+        <w:tc>
+          <w:tcPr/>
+          <w:p>
+            <w:pPr>
+              <w:pStyle w:val="Compact"/>
+              <w:jc w:val="left"/>
+            </w:pPr>
+            <w:r>
+              <w:t xml:space="preserve">D</w:t>
+            </w:r>
+          </w:p>
+        </w:tc>
+        <w:tc>
+          <w:tcPr/>
+          <w:p>
+            <w:pPr>
+              <w:pStyle w:val="Compact"/>
+              <w:jc w:val="left"/>
+            </w:pPr>
+            <w:r>
+              <w:t xml:space="preserve">lunedì mattina</w:t>
+            </w:r>
+          </w:p>
+        </w:tc>
+        <w:tc>
+          <w:tcPr/>
+          <w:p>
+            <w:pPr>
+              <w:pStyle w:val="Compact"/>
+              <w:jc w:val="left"/>
+            </w:pPr>
+            <w:r>
+              <w:t xml:space="preserve">Riallineamento dei due stage dalla produzione (passi 1-3 della guida) e rilancio degli installer dei lavori extra</w:t>
+            </w:r>
+          </w:p>
+        </w:tc>
+      </w:tr>
+      <w:tr>
+        <w:tc>
+          <w:tcPr/>
+          <w:p>
+            <w:pPr>
+              <w:pStyle w:val="Compact"/>
+              <w:jc w:val="left"/>
+            </w:pPr>
+            <w:r>
+              <w:t xml:space="preserve">5</w:t>
+            </w:r>
+          </w:p>
+        </w:tc>
+        <w:tc>
+          <w:tcPr/>
+          <w:p>
+            <w:pPr>
+              <w:pStyle w:val="Compact"/>
+              <w:jc w:val="left"/>
+            </w:pPr>
+            <w:r>
+              <w:t xml:space="preserve">D</w:t>
+            </w:r>
+          </w:p>
+        </w:tc>
+        <w:tc>
+          <w:tcPr/>
+          <w:p>
+            <w:pPr>
+              <w:pStyle w:val="Compact"/>
+              <w:jc w:val="left"/>
+            </w:pPr>
+            <w:r>
+              <w:t xml:space="preserve">lunedì</w:t>
+            </w:r>
+          </w:p>
+        </w:tc>
+        <w:tc>
+          <w:tcPr/>
+          <w:p>
+            <w:pPr>
+              <w:pStyle w:val="Compact"/>
+              <w:jc w:val="left"/>
+            </w:pPr>
+            <w:r>
+              <w:rPr>
+                <w:rStyle w:val="VerbatimChar"/>
+              </w:rPr>
+              <w:t xml:space="preserve">kos-ttfb-31-10</w:t>
+            </w:r>
+            <w:r>
+              <w:t xml:space="preserve"> </w:t>
+            </w:r>
+            <w:r>
+              <w:t xml:space="preserve">e</w:t>
+            </w:r>
+            <w:r>
+              <w:t xml:space="preserve"> </w:t>
+            </w:r>
+            <w:r>
+              <w:rPr>
+                <w:rStyle w:val="VerbatimChar"/>
+              </w:rPr>
+              <w:t xml:space="preserve">aa-news</w:t>
+            </w:r>
+            <w:r>
+              <w:t xml:space="preserve">: stage, collaudo, produzione, nella stessa finestra degli altri rilasci di lunedì</w:t>
+            </w:r>
+          </w:p>
+        </w:tc>
+      </w:tr>
+      <w:tr>
+        <w:tc>
+          <w:tcPr/>
+          <w:p>
+            <w:pPr>
+              <w:pStyle w:val="Compact"/>
+              <w:jc w:val="left"/>
+            </w:pPr>
+            <w:r>
+              <w:t xml:space="preserve">6</w:t>
+            </w:r>
+          </w:p>
+        </w:tc>
+        <w:tc>
+          <w:tcPr/>
+          <w:p>
+            <w:pPr>
+              <w:pStyle w:val="Compact"/>
+              <w:jc w:val="left"/>
+            </w:pPr>
+            <w:r>
+              <w:t xml:space="preserve">D</w:t>
+            </w:r>
+          </w:p>
+        </w:tc>
+        <w:tc>
+          <w:tcPr/>
+          <w:p>
+            <w:pPr>
+              <w:pStyle w:val="Compact"/>
+              <w:jc w:val="left"/>
+            </w:pPr>
+            <w:r>
+              <w:t xml:space="preserve">dopo ogni rilascio</w:t>
+            </w:r>
+          </w:p>
+        </w:tc>
+        <w:tc>
+          <w:tcPr/>
+          <w:p>
+            <w:pPr>
+              <w:pStyle w:val="Compact"/>
+              <w:jc w:val="left"/>
+            </w:pPr>
+            <w:r>
+              <w:t xml:space="preserve">Script della cartella</w:t>
+            </w:r>
+            <w:r>
+              <w:t xml:space="preserve"> </w:t>
+            </w:r>
+            <w:r>
+              <w:rPr>
+                <w:rStyle w:val="VerbatimChar"/>
+              </w:rPr>
+              <w:t xml:space="preserve">monitor</w:t>
+            </w:r>
+            <w:r>
+              <w:t xml:space="preserve">: link relativi, og:image, URL annidati; query</w:t>
+            </w:r>
+            <w:r>
+              <w:t xml:space="preserve"> </w:t>
+            </w:r>
+            <w:r>
+              <w:rPr>
+                <w:rStyle w:val="VerbatimChar"/>
+              </w:rPr>
+              <w:t xml:space="preserve">verifica-*.sql</w:t>
+            </w:r>
+            <w:r>
+              <w:t xml:space="preserve"> </w:t>
+            </w:r>
+            <w:r>
+              <w:t xml:space="preserve">su produzione</w:t>
+            </w:r>
+          </w:p>
+        </w:tc>
+      </w:tr>
+      <w:tr>
+        <w:tc>
+          <w:tcPr/>
+          <w:p>
+            <w:pPr>
+              <w:pStyle w:val="Compact"/>
+              <w:jc w:val="left"/>
+            </w:pPr>
+            <w:r>
+              <w:t xml:space="preserve">7</w:t>
+            </w:r>
+          </w:p>
+        </w:tc>
+        <w:tc>
+          <w:tcPr/>
+          <w:p>
+            <w:pPr>
+              <w:pStyle w:val="Compact"/>
+              <w:jc w:val="left"/>
+            </w:pPr>
+            <w:r>
+              <w:t xml:space="preserve">D</w:t>
+            </w:r>
+          </w:p>
+        </w:tc>
+        <w:tc>
+          <w:tcPr/>
+          <w:p>
+            <w:pPr>
+              <w:pStyle w:val="Compact"/>
+              <w:jc w:val="left"/>
+            </w:pPr>
+            <w:r>
+              <w:t xml:space="preserve">quando si tocca GTM</w:t>
+            </w:r>
+          </w:p>
+        </w:tc>
+        <w:tc>
+          <w:tcPr/>
+          <w:p>
+            <w:pPr>
+              <w:pStyle w:val="Compact"/>
+              <w:jc w:val="left"/>
+            </w:pPr>
+            <w:r>
+              <w:t xml:space="preserve">Tag Web Vitals (</w:t>
+            </w:r>
+            <w:r>
+              <w:rPr>
+                <w:rStyle w:val="VerbatimChar"/>
+              </w:rPr>
+              <w:t xml:space="preserve">gtm-web-vitals/</w:t>
+            </w:r>
+            <w:r>
+              <w:t xml:space="preserve">) importato con «Unisci» nella stessa area di lavoro dei filtri per hostname dello stage, o in sequenza, per evitare conflitti di versione</w:t>
+            </w:r>
+          </w:p>
+        </w:tc>
+      </w:tr>
+    </w:tbl>
+    <w:p>
+      <w:pPr>
+        <w:pStyle w:val="BodyText"/>
+      </w:pPr>
+      <w:r>
+        <w:t xml:space="preserve">Regola nuova (già in</w:t>
+      </w:r>
+      <w:r>
+        <w:t xml:space="preserve"> </w:t>
+      </w:r>
+      <w:r>
+        <w:rPr>
+          <w:rStyle w:val="VerbatimChar"/>
+        </w:rPr>
+        <w:t xml:space="preserve">CLAUDE.md</w:t>
+      </w:r>
+      <w:r>
+        <w:t xml:space="preserve">, da rispettare negli elementi del progetto): MODX esegue i tag anche dentro i commenti HTML;</w:t>
+      </w:r>
+      <w:r>
+        <w:t xml:space="preserve"> </w:t>
+      </w:r>
+      <w:r>
+        <w:t xml:space="preserve">per commentare un tag si usa</w:t>
+      </w:r>
+      <w:r>
+        <w:t xml:space="preserve"> </w:t>
+      </w:r>
+      <w:r>
+        <w:rPr>
+          <w:rStyle w:val="VerbatimChar"/>
+        </w:rPr>
+        <w:t xml:space="preserve">[[- ...]]</w:t>
+      </w:r>
+      <w:r>
+        <w:t xml:space="preserve">.</w:t>
+      </w:r>
+    </w:p>
+    <w:p>
+      <w:pPr>
+        <w:pStyle w:val="BodyText"/>
+      </w:pPr>
+      <w:r>
+        <w:t xml:space="preserve">Decisioni aperte dall'altra chat: pagine provincia vuote (vedi sopra: oggi 404; l'altra chat propone di completare le 4 con</w:t>
+      </w:r>
+      <w:r>
+        <w:t xml:space="preserve"> </w:t>
+      </w:r>
+      <w:r>
+        <w:t xml:space="preserve">strutture del gruppo, Roma, Grosseto, Imperia, Reggio Emilia, e 301 alla regione per le altre); paginazione di</w:t>
+      </w:r>
+      <w:r>
+        <w:t xml:space="preserve"> </w:t>
+      </w:r>
+      <w:r>
+        <w:rPr>
+          <w:rStyle w:val="VerbatimChar"/>
+        </w:rPr>
+        <w:t xml:space="preserve">/news/</w:t>
+      </w:r>
+      <w:r>
+        <w:t xml:space="preserve"> </w:t>
+      </w:r>
+      <w:r>
+        <w:t xml:space="preserve">(fuori piano); email offuscate con entità HTML su kosgroup (nel dato strutturato restano in chiaro); Cloud Edge rimandato.</w:t>
+      </w:r>
+    </w:p>
+    <w:bookmarkEnd w:id="26"/>
+    <w:bookmarkStart w:id="33" w:name="programma"/>
     <w:p>
       <w:pPr>
         <w:pStyle w:val="Heading2"/>
@@ -1696,7 +2558,7 @@
         <w:t xml:space="preserve">= Claude. Le stime di Danilo sono in ore effettive.</w:t>
       </w:r>
     </w:p>
-    <w:bookmarkStart w:id="26" w:name="X6c88cb8ab8bb842e40fe2ba9c248a69273f69d8"/>
+    <w:bookmarkStart w:id="27" w:name="X6c88cb8ab8bb842e40fe2ba9c248a69273f69d8"/>
     <w:p>
       <w:pPr>
         <w:pStyle w:val="Heading3"/>
@@ -1919,8 +2781,8 @@
         </w:tc>
       </w:tr>
     </w:tbl>
-    <w:bookmarkEnd w:id="26"/>
-    <w:bookmarkStart w:id="27" w:name="X24f00ea4a91daa355d7933937e8c7ffd1eeb76f"/>
+    <w:bookmarkEnd w:id="27"/>
+    <w:bookmarkStart w:id="28" w:name="X24f00ea4a91daa355d7933937e8c7ffd1eeb76f"/>
     <w:p>
       <w:pPr>
         <w:pStyle w:val="Heading3"/>
@@ -2324,8 +3186,8 @@
         </w:tc>
       </w:tr>
     </w:tbl>
-    <w:bookmarkEnd w:id="27"/>
-    <w:bookmarkStart w:id="28" w:name="martedì-311--call-kos-invio-allagenzia"/>
+    <w:bookmarkEnd w:id="28"/>
+    <w:bookmarkStart w:id="29" w:name="martedì-311--call-kos-invio-allagenzia"/>
     <w:p>
       <w:pPr>
         <w:pStyle w:val="Heading3"/>
@@ -2712,8 +3574,8 @@
         </w:tc>
       </w:tr>
     </w:tbl>
-    <w:bookmarkEnd w:id="28"/>
-    <w:bookmarkStart w:id="29" w:name="X8f1dfa7040175622d26fd4fcebc4b5f9a36bb23"/>
+    <w:bookmarkEnd w:id="29"/>
+    <w:bookmarkStart w:id="30" w:name="X8f1dfa7040175622d26fd4fcebc4b5f9a36bb23"/>
     <w:p>
       <w:pPr>
         <w:pStyle w:val="Heading3"/>
@@ -3142,8 +4004,8 @@
         </w:tc>
       </w:tr>
     </w:tbl>
-    <w:bookmarkEnd w:id="29"/>
-    <w:bookmarkStart w:id="30" w:name="X7de954f4b07d14870ac9711b8036516c1e393f1"/>
+    <w:bookmarkEnd w:id="30"/>
+    <w:bookmarkStart w:id="31" w:name="X7de954f4b07d14870ac9711b8036516c1e393f1"/>
     <w:p>
       <w:pPr>
         <w:pStyle w:val="Heading3"/>
@@ -3484,8 +4346,8 @@
         </w:tc>
       </w:tr>
     </w:tbl>
-    <w:bookmarkEnd w:id="30"/>
-    <w:bookmarkStart w:id="31" w:name="Xe7e79408a4ed13ae5ad4c712997a64652aebe43"/>
+    <w:bookmarkEnd w:id="31"/>
+    <w:bookmarkStart w:id="32" w:name="Xe7e79408a4ed13ae5ad4c712997a64652aebe43"/>
     <w:p>
       <w:pPr>
         <w:pStyle w:val="Heading3"/>
@@ -3748,9 +4610,9 @@
         </w:tc>
       </w:tr>
     </w:tbl>
-    <w:bookmarkEnd w:id="31"/>
     <w:bookmarkEnd w:id="32"/>
-    <w:bookmarkStart w:id="33" w:name="cosa-può-slittare-e-come-si-recupera"/>
+    <w:bookmarkEnd w:id="33"/>
+    <w:bookmarkStart w:id="34" w:name="cosa-può-slittare-e-come-si-recupera"/>
     <w:p>
       <w:pPr>
         <w:pStyle w:val="Heading2"/>
@@ -4041,8 +4903,8 @@
         </w:tc>
       </w:tr>
     </w:tbl>
-    <w:bookmarkEnd w:id="33"/>
-    <w:bookmarkStart w:id="34" w:name="fuori-da-questa-settimana"/>
+    <w:bookmarkEnd w:id="34"/>
+    <w:bookmarkStart w:id="35" w:name="fuori-da-questa-settimana"/>
     <w:p>
       <w:pPr>
         <w:pStyle w:val="Heading2"/>
@@ -4096,8 +4958,8 @@
         <w:t xml:space="preserve">Elenco degli errori attivi delle schede per KOS: dopo le verifiche di Danilo, con la call di martedì.</w:t>
       </w:r>
     </w:p>
-    <w:bookmarkEnd w:id="34"/>
     <w:bookmarkEnd w:id="35"/>
+    <w:bookmarkEnd w:id="36"/>
     <w:sectPr/>
   </w:body>
 </w:document>

</xml_diff>

<commit_message>
Controlli della chat sulle prestazioni nel repository (scripts/collaudo/monitor), istruzioni e handoff del 31/10; pagine provincia vuote senza impressioni in Search Console
Co-Authored-By: Claude Opus 5.5 <noreply@anthropic.com>
Claude-Session: https://claude.ai/code/session_01Rr1X44gsg7BUwMzrRvYrc2
</commit_message>
<xml_diff>
--- a/docs/docx/piano-settimana-2-6-novembre.docx
+++ b/docs/docx/piano-settimana-2-6-novembre.docx
@@ -2349,7 +2349,7 @@
               <w:jc w:val="left"/>
             </w:pPr>
             <w:r>
-              <w:t xml:space="preserve">Script della cartella</w:t>
+              <w:t xml:space="preserve">Script ora nel repository,</w:t>
             </w:r>
             <w:r>
               <w:t xml:space="preserve"> </w:t>
@@ -2358,10 +2358,13 @@
               <w:rPr>
                 <w:rStyle w:val="VerbatimChar"/>
               </w:rPr>
-              <w:t xml:space="preserve">monitor</w:t>
-            </w:r>
-            <w:r>
-              <w:t xml:space="preserve">: link relativi, og:image, URL annidati; query</w:t>
+              <w:t xml:space="preserve">scripts/collaudo/monitor/</w:t>
+            </w:r>
+            <w:r>
+              <w:t xml:space="preserve"> </w:t>
+            </w:r>
+            <w:r>
+              <w:t xml:space="preserve">(31/10): link relativi, og:image, URL annidati; query</w:t>
             </w:r>
             <w:r>
               <w:t xml:space="preserve"> </w:t>
@@ -2484,7 +2487,25 @@
         <w:pStyle w:val="BodyText"/>
       </w:pPr>
       <w:r>
-        <w:t xml:space="preserve">Decisioni aperte dall'altra chat: pagine provincia vuote (vedi sopra: oggi 404; l'altra chat propone di completare le 4 con</w:t>
+        <w:t xml:space="preserve">Decisioni aperte dall'altra chat: pagine provincia vuote (vedi sopra: oggi 404; Search Console 14/6/2025-23/10/2026, tabella</w:t>
+      </w:r>
+      <w:r>
+        <w:t xml:space="preserve"> </w:t>
+      </w:r>
+      <w:r>
+        <w:rPr>
+          <w:rStyle w:val="VerbatimChar"/>
+        </w:rPr>
+        <w:t xml:space="preserve">searchconsole_aa.storico_url_impression</w:t>
+      </w:r>
+      <w:r>
+        <w:t xml:space="preserve">: 0 impressioni per tutte e 11, contro 214.341 delle 14 pagine provincia pubblicate,</w:t>
+      </w:r>
+      <w:r>
+        <w:t xml:space="preserve"> </w:t>
+      </w:r>
+      <w:r>
+        <w:t xml:space="preserve">quindi nessun 301 necessario; l'altra chat propone di completare le 4 con</w:t>
       </w:r>
       <w:r>
         <w:t xml:space="preserve"> </w:t>

</xml_diff>

<commit_message>
KOS-3 KOS-4 regole web di produzione KOS del 31/10 nel repository (URL annidati 404, indirizzo tecnico, cache, cartelle documenti)
Co-Authored-By: Claude Opus 5.5 <noreply@anthropic.com>
Claude-Session: https://claude.ai/code/session_01Rr1X44gsg7BUwMzrRvYrc2
</commit_message>
<xml_diff>
--- a/docs/docx/piano-settimana-2-6-novembre.docx
+++ b/docs/docx/piano-settimana-2-6-novembre.docx
@@ -1923,7 +1923,7 @@
               <w:jc w:val="left"/>
             </w:pPr>
             <w:r>
-              <w:t xml:space="preserve">Confronto con il repository (esito: nessun elemento del progetto cambiato in produzione; baseline aggiornate con 23 elementi KOS e 21 AA cambiati o nuovi, segreti esclusi; regole web AA in</w:t>
+              <w:t xml:space="preserve">Confronto con il repository (esito: nessun elemento del progetto cambiato in produzione; baseline aggiornate con 23 elementi KOS e 21 AA cambiati o nuovi, segreti esclusi; regole web del 31/10 in</w:t>
             </w:r>
             <w:r>
               <w:t xml:space="preserve"> </w:t>
@@ -1932,10 +1932,13 @@
               <w:rPr>
                 <w:rStyle w:val="VerbatimChar"/>
               </w:rPr>
-              <w:t xml:space="preserve">anniazzurri/files/web-rules/produzione-2026-10-31.conf</w:t>
-            </w:r>
-            <w:r>
-              <w:t xml:space="preserve">; manca la copia delle regole web KOS): elementi del progetto cambiati in produzione (es.</w:t>
+              <w:t xml:space="preserve">&lt;sito&gt;/files/web-rules/produzione-2026-10-31.conf</w:t>
+            </w:r>
+            <w:r>
+              <w:t xml:space="preserve"> </w:t>
+            </w:r>
+            <w:r>
+              <w:t xml:space="preserve">per entrambi i siti): elementi del progetto cambiati in produzione (es.</w:t>
             </w:r>
             <w:r>
               <w:t xml:space="preserve"> </w:t>

</xml_diff>

<commit_message>
KOS-2 censimento delle chiamate non in cache rimaste nei due siti, candidate e da lasciare
Co-Authored-By: Claude Opus 5.5 <noreply@anthropic.com>
Claude-Session: https://claude.ai/code/session_01Rr1X44gsg7BUwMzrRvYrc2
</commit_message>
<xml_diff>
--- a/docs/docx/piano-settimana-2-6-novembre.docx
+++ b/docs/docx/piano-settimana-2-6-novembre.docx
@@ -2476,6 +2476,672 @@
         <w:pStyle w:val="BodyText"/>
       </w:pPr>
       <w:r>
+        <w:rPr>
+          <w:bCs/>
+          <w:b/>
+        </w:rPr>
+        <w:t xml:space="preserve">Chiamate non in cache rimaste (censimento del 31/10 sugli export di produzione).</w:t>
+      </w:r>
+      <w:r>
+        <w:t xml:space="preserve"> </w:t>
+      </w:r>
+      <w:r>
+        <w:t xml:space="preserve">Candidate alla cache (nessuna</w:t>
+      </w:r>
+      <w:r>
+        <w:t xml:space="preserve"> </w:t>
+      </w:r>
+      <w:r>
+        <w:t xml:space="preserve">dipendenza da richiesta, sessione o ora del giorno; la cache di MODX è per pagina e si svuota a ogni salvataggio):</w:t>
+      </w:r>
+    </w:p>
+    <w:p>
+      <w:pPr>
+        <w:numPr>
+          <w:ilvl w:val="0"/>
+          <w:numId w:val="1004"/>
+        </w:numPr>
+        <w:pStyle w:val="Compact"/>
+      </w:pPr>
+      <w:r>
+        <w:t xml:space="preserve">AA, su tutte o quasi le pagine:</w:t>
+      </w:r>
+      <w:r>
+        <w:t xml:space="preserve"> </w:t>
+      </w:r>
+      <w:r>
+        <w:rPr>
+          <w:rStyle w:val="VerbatimChar"/>
+        </w:rPr>
+        <w:t xml:space="preserve">[[!Canonical]]</w:t>
+      </w:r>
+      <w:r>
+        <w:t xml:space="preserve"> </w:t>
+      </w:r>
+      <w:r>
+        <w:t xml:space="preserve">nei 26 head e in</w:t>
+      </w:r>
+      <w:r>
+        <w:t xml:space="preserve"> </w:t>
+      </w:r>
+      <w:r>
+        <w:rPr>
+          <w:rStyle w:val="VerbatimChar"/>
+        </w:rPr>
+        <w:t xml:space="preserve">convegnoAA</w:t>
+      </w:r>
+      <w:r>
+        <w:t xml:space="preserve">;</w:t>
+      </w:r>
+      <w:r>
+        <w:t xml:space="preserve"> </w:t>
+      </w:r>
+      <w:r>
+        <w:rPr>
+          <w:rStyle w:val="VerbatimChar"/>
+        </w:rPr>
+        <w:t xml:space="preserve">[[!Wayfinder]]</w:t>
+      </w:r>
+      <w:r>
+        <w:t xml:space="preserve"> </w:t>
+      </w:r>
+      <w:r>
+        <w:t xml:space="preserve">nei template</w:t>
+      </w:r>
+      <w:r>
+        <w:t xml:space="preserve"> </w:t>
+      </w:r>
+      <w:r>
+        <w:rPr>
+          <w:rStyle w:val="VerbatimChar"/>
+        </w:rPr>
+        <w:t xml:space="preserve">interna-menu-*</w:t>
+      </w:r>
+      <w:r>
+        <w:t xml:space="preserve">;</w:t>
+      </w:r>
+      <w:r>
+        <w:t xml:space="preserve"> </w:t>
+      </w:r>
+      <w:r>
+        <w:rPr>
+          <w:rStyle w:val="VerbatimChar"/>
+        </w:rPr>
+        <w:t xml:space="preserve">[[!CompanyInfo]]</w:t>
+      </w:r>
+      <w:r>
+        <w:t xml:space="preserve"> </w:t>
+      </w:r>
+      <w:r>
+        <w:t xml:space="preserve">nel footer;</w:t>
+      </w:r>
+      <w:r>
+        <w:t xml:space="preserve"> </w:t>
+      </w:r>
+      <w:r>
+        <w:rPr>
+          <w:rStyle w:val="VerbatimChar"/>
+        </w:rPr>
+        <w:t xml:space="preserve">[[!ContactInfo]]</w:t>
+      </w:r>
+      <w:r>
+        <w:t xml:space="preserve"> </w:t>
+      </w:r>
+      <w:r>
+        <w:t xml:space="preserve">nei</w:t>
+      </w:r>
+      <w:r>
+        <w:t xml:space="preserve"> </w:t>
+      </w:r>
+      <w:r>
+        <w:rPr>
+          <w:rStyle w:val="VerbatimChar"/>
+        </w:rPr>
+        <w:t xml:space="preserve">contactBox</w:t>
+      </w:r>
+      <w:r>
+        <w:t xml:space="preserve">;</w:t>
+      </w:r>
+      <w:r>
+        <w:t xml:space="preserve"> </w:t>
+      </w:r>
+      <w:r>
+        <w:rPr>
+          <w:rStyle w:val="VerbatimChar"/>
+        </w:rPr>
+        <w:t xml:space="preserve">[[!newsByStruttura]]</w:t>
+      </w:r>
+      <w:r>
+        <w:t xml:space="preserve"> </w:t>
+      </w:r>
+      <w:r>
+        <w:t xml:space="preserve">e</w:t>
+      </w:r>
+      <w:r>
+        <w:t xml:space="preserve"> </w:t>
+      </w:r>
+      <w:r>
+        <w:rPr>
+          <w:rStyle w:val="VerbatimChar"/>
+        </w:rPr>
+        <w:t xml:space="preserve">[[!getResources]]</w:t>
+      </w:r>
+      <w:r>
+        <w:t xml:space="preserve"> </w:t>
+      </w:r>
+      <w:r>
+        <w:t xml:space="preserve">in</w:t>
+      </w:r>
+      <w:r>
+        <w:t xml:space="preserve"> </w:t>
+      </w:r>
+      <w:r>
+        <w:rPr>
+          <w:rStyle w:val="VerbatimChar"/>
+        </w:rPr>
+        <w:t xml:space="preserve">rsa</w:t>
+      </w:r>
+      <w:r>
+        <w:t xml:space="preserve"> </w:t>
+      </w:r>
+      <w:r>
+        <w:t xml:space="preserve">e</w:t>
+      </w:r>
+      <w:r>
+        <w:t xml:space="preserve"> </w:t>
+      </w:r>
+      <w:r>
+        <w:rPr>
+          <w:rStyle w:val="VerbatimChar"/>
+        </w:rPr>
+        <w:t xml:space="preserve">interna-articolo</w:t>
+      </w:r>
+      <w:r>
+        <w:t xml:space="preserve">;</w:t>
+      </w:r>
+      <w:r>
+        <w:t xml:space="preserve"> </w:t>
+      </w:r>
+      <w:r>
+        <w:rPr>
+          <w:rStyle w:val="VerbatimChar"/>
+        </w:rPr>
+        <w:t xml:space="preserve">[[!docList]]</w:t>
+      </w:r>
+      <w:r>
+        <w:t xml:space="preserve"> </w:t>
+      </w:r>
+      <w:r>
+        <w:t xml:space="preserve">in 3 chunk (come KOS: in cache con</w:t>
+      </w:r>
+      <w:r>
+        <w:t xml:space="preserve"> </w:t>
+      </w:r>
+      <w:r>
+        <w:rPr>
+          <w:rStyle w:val="VerbatimChar"/>
+        </w:rPr>
+        <w:t xml:space="preserve">&amp;cacheTtl</w:t>
+      </w:r>
+      <w:r>
+        <w:t xml:space="preserve">).</w:t>
+      </w:r>
+    </w:p>
+    <w:p>
+      <w:pPr>
+        <w:numPr>
+          <w:ilvl w:val="0"/>
+          <w:numId w:val="1004"/>
+        </w:numPr>
+        <w:pStyle w:val="Compact"/>
+      </w:pPr>
+      <w:r>
+        <w:t xml:space="preserve">KOS:</w:t>
+      </w:r>
+      <w:r>
+        <w:t xml:space="preserve"> </w:t>
+      </w:r>
+      <w:r>
+        <w:rPr>
+          <w:rStyle w:val="VerbatimChar"/>
+        </w:rPr>
+        <w:t xml:space="preserve">[[!contenutiStruttura]]</w:t>
+      </w:r>
+      <w:r>
+        <w:t xml:space="preserve"> </w:t>
+      </w:r>
+      <w:r>
+        <w:t xml:space="preserve">nei template</w:t>
+      </w:r>
+      <w:r>
+        <w:t xml:space="preserve"> </w:t>
+      </w:r>
+      <w:r>
+        <w:rPr>
+          <w:rStyle w:val="VerbatimChar"/>
+        </w:rPr>
+        <w:t xml:space="preserve">strutture</w:t>
+      </w:r>
+      <w:r>
+        <w:t xml:space="preserve">,</w:t>
+      </w:r>
+      <w:r>
+        <w:t xml:space="preserve"> </w:t>
+      </w:r>
+      <w:r>
+        <w:rPr>
+          <w:rStyle w:val="VerbatimChar"/>
+        </w:rPr>
+        <w:t xml:space="preserve">strutture-VDP</w:t>
+      </w:r>
+      <w:r>
+        <w:t xml:space="preserve"> </w:t>
+      </w:r>
+      <w:r>
+        <w:t xml:space="preserve">(ogni scheda struttura;</w:t>
+      </w:r>
+      <w:r>
+        <w:t xml:space="preserve"> </w:t>
+      </w:r>
+      <w:r>
+        <w:rPr>
+          <w:rStyle w:val="VerbatimChar"/>
+        </w:rPr>
+        <w:t xml:space="preserve">date()</w:t>
+      </w:r>
+      <w:r>
+        <w:t xml:space="preserve"> </w:t>
+      </w:r>
+      <w:r>
+        <w:t xml:space="preserve">solo per formattare</w:t>
+      </w:r>
+      <w:r>
+        <w:t xml:space="preserve"> </w:t>
+      </w:r>
+      <w:r>
+        <w:t xml:space="preserve">la data di pubblicazione);</w:t>
+      </w:r>
+      <w:r>
+        <w:t xml:space="preserve"> </w:t>
+      </w:r>
+      <w:r>
+        <w:rPr>
+          <w:rStyle w:val="VerbatimChar"/>
+        </w:rPr>
+        <w:t xml:space="preserve">[[!Wayfinder]]</w:t>
+      </w:r>
+      <w:r>
+        <w:t xml:space="preserve"> </w:t>
+      </w:r>
+      <w:r>
+        <w:t xml:space="preserve">nei chunk</w:t>
+      </w:r>
+      <w:r>
+        <w:t xml:space="preserve"> </w:t>
+      </w:r>
+      <w:r>
+        <w:rPr>
+          <w:rStyle w:val="VerbatimChar"/>
+        </w:rPr>
+        <w:t xml:space="preserve">aree-di-intervento-*</w:t>
+      </w:r>
+      <w:r>
+        <w:t xml:space="preserve"> </w:t>
+      </w:r>
+      <w:r>
+        <w:t xml:space="preserve">e</w:t>
+      </w:r>
+      <w:r>
+        <w:t xml:space="preserve"> </w:t>
+      </w:r>
+      <w:r>
+        <w:rPr>
+          <w:rStyle w:val="VerbatimChar"/>
+        </w:rPr>
+        <w:t xml:space="preserve">menu-en</w:t>
+      </w:r>
+      <w:r>
+        <w:t xml:space="preserve">;</w:t>
+      </w:r>
+      <w:r>
+        <w:t xml:space="preserve"> </w:t>
+      </w:r>
+      <w:r>
+        <w:rPr>
+          <w:rStyle w:val="VerbatimChar"/>
+        </w:rPr>
+        <w:t xml:space="preserve">[[!pdoResources]]</w:t>
+      </w:r>
+      <w:r>
+        <w:t xml:space="preserve">,</w:t>
+      </w:r>
+      <w:r>
+        <w:t xml:space="preserve"> </w:t>
+      </w:r>
+      <w:r>
+        <w:rPr>
+          <w:rStyle w:val="VerbatimChar"/>
+        </w:rPr>
+        <w:t xml:space="preserve">[[!getResources]]</w:t>
+      </w:r>
+      <w:r>
+        <w:t xml:space="preserve">,</w:t>
+      </w:r>
+      <w:r>
+        <w:t xml:space="preserve"> </w:t>
+      </w:r>
+      <w:r>
+        <w:rPr>
+          <w:rStyle w:val="VerbatimChar"/>
+        </w:rPr>
+        <w:t xml:space="preserve">[[!pdoField]]</w:t>
+      </w:r>
+      <w:r>
+        <w:t xml:space="preserve">,</w:t>
+      </w:r>
+      <w:r>
+        <w:t xml:space="preserve"> </w:t>
+      </w:r>
+      <w:r>
+        <w:rPr>
+          <w:rStyle w:val="VerbatimChar"/>
+        </w:rPr>
+        <w:t xml:space="preserve">[[!pdoMenu]]</w:t>
+      </w:r>
+      <w:r>
+        <w:t xml:space="preserve"> </w:t>
+      </w:r>
+      <w:r>
+        <w:t xml:space="preserve">negli elenchi;</w:t>
+      </w:r>
+      <w:r>
+        <w:t xml:space="preserve"> </w:t>
+      </w:r>
+      <w:r>
+        <w:rPr>
+          <w:rStyle w:val="VerbatimChar"/>
+        </w:rPr>
+        <w:t xml:space="preserve">[[!DisplayResourceTags]]</w:t>
+      </w:r>
+      <w:r>
+        <w:t xml:space="preserve"> </w:t>
+      </w:r>
+      <w:r>
+        <w:t xml:space="preserve">nel template</w:t>
+      </w:r>
+      <w:r>
+        <w:t xml:space="preserve"> </w:t>
+      </w:r>
+      <w:r>
+        <w:rPr>
+          <w:rStyle w:val="VerbatimChar"/>
+        </w:rPr>
+        <w:t xml:space="preserve">video</w:t>
+      </w:r>
+      <w:r>
+        <w:t xml:space="preserve">;</w:t>
+      </w:r>
+      <w:r>
+        <w:t xml:space="preserve"> </w:t>
+      </w:r>
+      <w:r>
+        <w:rPr>
+          <w:rStyle w:val="VerbatimChar"/>
+        </w:rPr>
+        <w:t xml:space="preserve">[[!Canonical]]</w:t>
+      </w:r>
+      <w:r>
+        <w:t xml:space="preserve"> </w:t>
+      </w:r>
+      <w:r>
+        <w:t xml:space="preserve">in</w:t>
+      </w:r>
+      <w:r>
+        <w:t xml:space="preserve"> </w:t>
+      </w:r>
+      <w:r>
+        <w:rPr>
+          <w:rStyle w:val="VerbatimChar"/>
+        </w:rPr>
+        <w:t xml:space="preserve">head-formazione</w:t>
+      </w:r>
+      <w:r>
+        <w:t xml:space="preserve">,</w:t>
+      </w:r>
+      <w:r>
+        <w:t xml:space="preserve"> </w:t>
+      </w:r>
+      <w:r>
+        <w:rPr>
+          <w:rStyle w:val="VerbatimChar"/>
+        </w:rPr>
+        <w:t xml:space="preserve">head-strutture-test</w:t>
+      </w:r>
+      <w:r>
+        <w:t xml:space="preserve">;</w:t>
+      </w:r>
+      <w:r>
+        <w:t xml:space="preserve"> </w:t>
+      </w:r>
+      <w:r>
+        <w:rPr>
+          <w:rStyle w:val="VerbatimChar"/>
+        </w:rPr>
+        <w:t xml:space="preserve">[[!copyYears]]</w:t>
+      </w:r>
+      <w:r>
+        <w:t xml:space="preserve">.</w:t>
+      </w:r>
+      <w:r>
+        <w:t xml:space="preserve"> </w:t>
+      </w:r>
+      <w:r>
+        <w:t xml:space="preserve">Da lasciare non in cache:</w:t>
+      </w:r>
+      <w:r>
+        <w:t xml:space="preserve"> </w:t>
+      </w:r>
+      <w:r>
+        <w:rPr>
+          <w:rStyle w:val="VerbatimChar"/>
+        </w:rPr>
+        <w:t xml:space="preserve">switchCta*</w:t>
+      </w:r>
+      <w:r>
+        <w:t xml:space="preserve">,</w:t>
+      </w:r>
+      <w:r>
+        <w:t xml:space="preserve"> </w:t>
+      </w:r>
+      <w:r>
+        <w:rPr>
+          <w:rStyle w:val="VerbatimChar"/>
+        </w:rPr>
+        <w:t xml:space="preserve">switchCtaHoliday</w:t>
+      </w:r>
+      <w:r>
+        <w:t xml:space="preserve">,</w:t>
+      </w:r>
+      <w:r>
+        <w:t xml:space="preserve"> </w:t>
+      </w:r>
+      <w:r>
+        <w:rPr>
+          <w:rStyle w:val="VerbatimChar"/>
+        </w:rPr>
+        <w:t xml:space="preserve">dayLeft</w:t>
+      </w:r>
+      <w:r>
+        <w:t xml:space="preserve">,</w:t>
+      </w:r>
+      <w:r>
+        <w:t xml:space="preserve"> </w:t>
+      </w:r>
+      <w:r>
+        <w:rPr>
+          <w:rStyle w:val="VerbatimChar"/>
+        </w:rPr>
+        <w:t xml:space="preserve">currentMonth</w:t>
+      </w:r>
+      <w:r>
+        <w:t xml:space="preserve"> </w:t>
+      </w:r>
+      <w:r>
+        <w:t xml:space="preserve">(landing AA, dipendono dalla data),</w:t>
+      </w:r>
+      <w:r>
+        <w:t xml:space="preserve"> </w:t>
+      </w:r>
+      <w:r>
+        <w:rPr>
+          <w:rStyle w:val="VerbatimChar"/>
+        </w:rPr>
+        <w:t xml:space="preserve">nverdeMenuItem</w:t>
+      </w:r>
+      <w:r>
+        <w:t xml:space="preserve"> </w:t>
+      </w:r>
+      <w:r>
+        <w:t xml:space="preserve">e</w:t>
+      </w:r>
+      <w:r>
+        <w:t xml:space="preserve"> </w:t>
+      </w:r>
+      <w:r>
+        <w:rPr>
+          <w:rStyle w:val="VerbatimChar"/>
+        </w:rPr>
+        <w:t xml:space="preserve">getMenuContact</w:t>
+      </w:r>
+      <w:r>
+        <w:t xml:space="preserve"> </w:t>
+      </w:r>
+      <w:r>
+        <w:t xml:space="preserve">(orari),</w:t>
+      </w:r>
+      <w:r>
+        <w:t xml:space="preserve"> </w:t>
+      </w:r>
+      <w:r>
+        <w:rPr>
+          <w:rStyle w:val="VerbatimChar"/>
+        </w:rPr>
+        <w:t xml:space="preserve">prenotaOnline</w:t>
+      </w:r>
+      <w:r>
+        <w:t xml:space="preserve"> </w:t>
+      </w:r>
+      <w:r>
+        <w:t xml:space="preserve">e</w:t>
+      </w:r>
+      <w:r>
+        <w:t xml:space="preserve"> </w:t>
+      </w:r>
+      <w:r>
+        <w:rPr>
+          <w:rStyle w:val="VerbatimChar"/>
+        </w:rPr>
+        <w:t xml:space="preserve">mostraPrestazioniPerBranca</w:t>
+      </w:r>
+      <w:r>
+        <w:t xml:space="preserve"> </w:t>
+      </w:r>
+      <w:r>
+        <w:t xml:space="preserve">(chiamate esterne in tempo</w:t>
+      </w:r>
+      <w:r>
+        <w:t xml:space="preserve"> </w:t>
+      </w:r>
+      <w:r>
+        <w:t xml:space="preserve">reale),</w:t>
+      </w:r>
+      <w:r>
+        <w:t xml:space="preserve"> </w:t>
+      </w:r>
+      <w:r>
+        <w:rPr>
+          <w:rStyle w:val="VerbatimChar"/>
+        </w:rPr>
+        <w:t xml:space="preserve">comunicatoRedirect</w:t>
+      </w:r>
+      <w:r>
+        <w:t xml:space="preserve"> </w:t>
+      </w:r>
+      <w:r>
+        <w:t xml:space="preserve">(reindirizza), FormIt e reCAPTCHA,</w:t>
+      </w:r>
+      <w:r>
+        <w:t xml:space="preserve"> </w:t>
+      </w:r>
+      <w:r>
+        <w:rPr>
+          <w:rStyle w:val="VerbatimChar"/>
+        </w:rPr>
+        <w:t xml:space="preserve">WAVEChecker</w:t>
+      </w:r>
+      <w:r>
+        <w:t xml:space="preserve">.</w:t>
+      </w:r>
+      <w:r>
+        <w:t xml:space="preserve"> </w:t>
+      </w:r>
+      <w:r>
+        <w:t xml:space="preserve">Proposta: pacchetti</w:t>
+      </w:r>
+      <w:r>
+        <w:t xml:space="preserve"> </w:t>
+      </w:r>
+      <w:r>
+        <w:rPr>
+          <w:rStyle w:val="VerbatimChar"/>
+        </w:rPr>
+        <w:t xml:space="preserve">kos-ttfb-2</w:t>
+      </w:r>
+      <w:r>
+        <w:t xml:space="preserve"> </w:t>
+      </w:r>
+      <w:r>
+        <w:t xml:space="preserve">(voce KOS-2, sprint 2) e</w:t>
+      </w:r>
+      <w:r>
+        <w:t xml:space="preserve"> </w:t>
+      </w:r>
+      <w:r>
+        <w:rPr>
+          <w:rStyle w:val="VerbatimChar"/>
+        </w:rPr>
+        <w:t xml:space="preserve">aa-ttfb</w:t>
+      </w:r>
+      <w:r>
+        <w:t xml:space="preserve"> </w:t>
+      </w:r>
+      <w:r>
+        <w:t xml:space="preserve">(miglioria, gli head AA sono elementi dello sprint 1:</w:t>
+      </w:r>
+      <w:r>
+        <w:t xml:space="preserve"> </w:t>
+      </w:r>
+      <w:r>
+        <w:t xml:space="preserve">uscita entro il 6/11 o dopo il 14/11), misura prima e dopo con</w:t>
+      </w:r>
+      <w:r>
+        <w:t xml:space="preserve"> </w:t>
+      </w:r>
+      <w:r>
+        <w:rPr>
+          <w:rStyle w:val="VerbatimChar"/>
+        </w:rPr>
+        <w:t xml:space="preserve">scripts/collaudo/monitor/misura-ttfb.ps1</w:t>
+      </w:r>
+      <w:r>
+        <w:t xml:space="preserve">.</w:t>
+      </w:r>
+    </w:p>
+    <w:p>
+      <w:pPr>
+        <w:pStyle w:val="FirstParagraph"/>
+      </w:pPr>
+      <w:r>
         <w:t xml:space="preserve">Regola nuova (già in</w:t>
       </w:r>
       <w:r>
@@ -4965,7 +5631,7 @@
       <w:pPr>
         <w:numPr>
           <w:ilvl w:val="0"/>
-          <w:numId w:val="1004"/>
+          <w:numId w:val="1005"/>
         </w:numPr>
         <w:pStyle w:val="Compact"/>
       </w:pPr>
@@ -4977,7 +5643,7 @@
       <w:pPr>
         <w:numPr>
           <w:ilvl w:val="0"/>
-          <w:numId w:val="1004"/>
+          <w:numId w:val="1005"/>
         </w:numPr>
         <w:pStyle w:val="Compact"/>
       </w:pPr>
@@ -4998,7 +5664,7 @@
       <w:pPr>
         <w:numPr>
           <w:ilvl w:val="0"/>
-          <w:numId w:val="1004"/>
+          <w:numId w:val="1005"/>
         </w:numPr>
         <w:pStyle w:val="Compact"/>
       </w:pPr>
@@ -5315,6 +5981,9 @@
     <w:abstractNumId w:val="991"/>
   </w:num>
   <w:num w:numId="1004">
+    <w:abstractNumId w:val="991"/>
+  </w:num>
+  <w:num w:numId="1005">
     <w:abstractNumId w:val="991"/>
   </w:num>
 </w:numbering>

</xml_diff>

<commit_message>
Piano: tag Web Vitals pubblicati, verifica dei dati in BigQuery martedì
Co-Authored-By: Claude Opus 5.5 <noreply@anthropic.com>
Claude-Session: https://claude.ai/code/session_01Rr1X44gsg7BUwMzrRvYrc2
</commit_message>
<xml_diff>
--- a/docs/docx/piano-settimana-2-6-novembre.docx
+++ b/docs/docx/piano-settimana-2-6-novembre.docx
@@ -2421,6 +2421,111 @@
             </w:pPr>
             <w:r>
               <w:t xml:space="preserve">7</w:t>
+            </w:r>
+          </w:p>
+        </w:tc>
+        <w:tc>
+          <w:tcPr/>
+          <w:p>
+            <w:pPr>
+              <w:pStyle w:val="Compact"/>
+              <w:jc w:val="left"/>
+            </w:pPr>
+            <w:r>
+              <w:t xml:space="preserve">D</w:t>
+            </w:r>
+          </w:p>
+        </w:tc>
+        <w:tc>
+          <w:tcPr/>
+          <w:p>
+            <w:pPr>
+              <w:pStyle w:val="Compact"/>
+              <w:jc w:val="left"/>
+            </w:pPr>
+            <w:r>
+              <w:rPr>
+                <w:bCs/>
+                <w:b/>
+              </w:rPr>
+              <w:t xml:space="preserve">pubblicato il 31/10</w:t>
+            </w:r>
+            <w:r>
+              <w:t xml:space="preserve"> </w:t>
+            </w:r>
+            <w:r>
+              <w:t xml:space="preserve">(Danilo)</w:t>
+            </w:r>
+          </w:p>
+        </w:tc>
+        <w:tc>
+          <w:tcPr/>
+          <w:p>
+            <w:pPr>
+              <w:pStyle w:val="Compact"/>
+              <w:jc w:val="left"/>
+            </w:pPr>
+            <w:r>
+              <w:t xml:space="preserve">Tag Web Vitals nei due container GTM; attivatori limitati all'hostname di produzione, quindi gli stage restano esclusi. Primi dati in BigQuery (</w:t>
+            </w:r>
+            <w:r>
+              <w:rPr>
+                <w:rStyle w:val="VerbatimChar"/>
+              </w:rPr>
+              <w:t xml:space="preserve">analytics_333083624</w:t>
+            </w:r>
+            <w:r>
+              <w:t xml:space="preserve">,</w:t>
+            </w:r>
+            <w:r>
+              <w:t xml:space="preserve"> </w:t>
+            </w:r>
+            <w:r>
+              <w:rPr>
+                <w:rStyle w:val="VerbatimChar"/>
+              </w:rPr>
+              <w:t xml:space="preserve">analytics_250584060</w:t>
+            </w:r>
+            <w:r>
+              <w:t xml:space="preserve">) dalla tabella giornaliera del giorno dopo; martedì 3/11 C verifica la presenza dell'evento</w:t>
+            </w:r>
+            <w:r>
+              <w:t xml:space="preserve"> </w:t>
+            </w:r>
+            <w:r>
+              <w:rPr>
+                <w:rStyle w:val="VerbatimChar"/>
+              </w:rPr>
+              <w:t xml:space="preserve">web_vitals</w:t>
+            </w:r>
+            <w:r>
+              <w:t xml:space="preserve"> </w:t>
+            </w:r>
+            <w:r>
+              <w:t xml:space="preserve">e lancia la prima analisi (</w:t>
+            </w:r>
+            <w:r>
+              <w:rPr>
+                <w:rStyle w:val="VerbatimChar"/>
+              </w:rPr>
+              <w:t xml:space="preserve">gtm-web-vitals/web-vitals-bigquery.sql</w:t>
+            </w:r>
+            <w:r>
+              <w:t xml:space="preserve">), da usare come «prima» per i pacchetti di cache del 2-6/11</w:t>
+            </w:r>
+          </w:p>
+        </w:tc>
+      </w:tr>
+      <w:tr>
+        <w:tc>
+          <w:tcPr/>
+          <w:p>
+            <w:pPr>
+              <w:pStyle w:val="Compact"/>
+              <w:jc w:val="left"/>
+            </w:pPr>
+            <w:r>
+              <w:t xml:space="preserve">7 bis</w:t>
             </w:r>
           </w:p>
         </w:tc>

</xml_diff>